<commit_message>
feat(docx): draw bubble, stock, treemap and sunburst charts
The Word chart fixture generator now authors a bubble, an
open-high-low-close stock, a treemap and a sunburst chart (the extended
ones are authored in Excel and pasted, as Word cannot add them itself), and
chart-families.docx is regenerated. Word paints them from the values and
category levels cached in the parts through the shared chart painter.

Co-Authored-By: Claude Opus 5.5 <noreply@anthropic.com>
</commit_message>
<xml_diff>
--- a/src/core/docx/__fixtures__/chart-families.docx
+++ b/src/core/docx/__fixtures__/chart-families.docx
@@ -13,13 +13,13 @@
           <w:noProof/>
         </w:rPr>
         <w:drawing>
-          <wp:inline distT="0" distB="0" distL="0" distR="0" wp14:anchorId="6B8A0872" wp14:editId="2972E591">
+          <wp:inline distT="0" distB="0" distL="0" distR="0" wp14:anchorId="53907E44" wp14:editId="6948D32A">
             <wp:extent cx="4572000" cy="2794000"/>
             <wp:effectExtent l="0" t="0" r="0" b="6350"/>
-            <wp:docPr id="202632412" name="Chart 1">
+            <wp:docPr id="616764080" name="Chart 1">
               <a:extLst xmlns:a="http://schemas.openxmlformats.org/drawingml/2006/main">
                 <a:ext uri="{FF2B5EF4-FFF2-40B4-BE49-F238E27FC236}">
-                  <a16:creationId xmlns:a16="http://schemas.microsoft.com/office/drawing/2014/main" id="{A1CA96F8-DDD3-710E-4FE5-0BB3FE0F0B57}"/>
+                  <a16:creationId xmlns:a16="http://schemas.microsoft.com/office/drawing/2014/main" id="{D69096DA-A448-BCB0-D13C-FCB59B2D65BE}"/>
                 </a:ext>
               </a:extLst>
             </wp:docPr>
@@ -46,13 +46,13 @@
         <mc:AlternateContent>
           <mc:Choice Requires="cx1">
             <w:drawing>
-              <wp:inline distT="0" distB="0" distL="0" distR="0" wp14:anchorId="6DDB360A" wp14:editId="0DB505A3">
+              <wp:inline distT="0" distB="0" distL="0" distR="0" wp14:anchorId="12617CF6" wp14:editId="410397E6">
                 <wp:extent cx="4572000" cy="2794000"/>
                 <wp:effectExtent l="0" t="0" r="0" b="6350"/>
-                <wp:docPr id="961519377" name="Chart 1">
+                <wp:docPr id="352800646" name="Chart 1">
                   <a:extLst xmlns:a="http://schemas.openxmlformats.org/drawingml/2006/main">
                     <a:ext uri="{FF2B5EF4-FFF2-40B4-BE49-F238E27FC236}">
-                      <a16:creationId xmlns:a16="http://schemas.microsoft.com/office/drawing/2014/main" id="{BCF974A0-E594-188C-90D1-C2AD9C8D522E}"/>
+                      <a16:creationId xmlns:a16="http://schemas.microsoft.com/office/drawing/2014/main" id="{64C3DE9E-8C55-7445-604D-DF48F1197E30}"/>
                     </a:ext>
                   </a:extLst>
                 </wp:docPr>
@@ -67,13 +67,13 @@
           </mc:Choice>
           <mc:Fallback>
             <w:drawing>
-              <wp:inline distT="0" distB="0" distL="0" distR="0" wp14:anchorId="6DDB360A" wp14:editId="0DB505A3">
+              <wp:inline distT="0" distB="0" distL="0" distR="0" wp14:anchorId="12617CF6" wp14:editId="410397E6">
                 <wp:extent cx="4572000" cy="2794000"/>
                 <wp:effectExtent l="0" t="0" r="0" b="6350"/>
-                <wp:docPr id="961519377" name="Chart 1">
+                <wp:docPr id="352800646" name="Chart 1">
                   <a:extLst xmlns:a="http://schemas.openxmlformats.org/drawingml/2006/main">
                     <a:ext uri="{FF2B5EF4-FFF2-40B4-BE49-F238E27FC236}">
-                      <a16:creationId xmlns:a16="http://schemas.microsoft.com/office/drawing/2014/main" id="{BCF974A0-E594-188C-90D1-C2AD9C8D522E}"/>
+                      <a16:creationId xmlns:a16="http://schemas.microsoft.com/office/drawing/2014/main" id="{64C3DE9E-8C55-7445-604D-DF48F1197E30}"/>
                     </a:ext>
                   </a:extLst>
                 </wp:docPr>
@@ -84,10 +84,10 @@
                   <a:graphicData uri="http://schemas.openxmlformats.org/drawingml/2006/picture">
                     <pic:pic xmlns:pic="http://schemas.openxmlformats.org/drawingml/2006/picture">
                       <pic:nvPicPr>
-                        <pic:cNvPr id="961519377" name="Chart 1">
+                        <pic:cNvPr id="352800646" name="Chart 1">
                           <a:extLst>
                             <a:ext uri="{FF2B5EF4-FFF2-40B4-BE49-F238E27FC236}">
-                              <a16:creationId xmlns:a16="http://schemas.microsoft.com/office/drawing/2014/main" id="{BCF974A0-E594-188C-90D1-C2AD9C8D522E}"/>
+                              <a16:creationId xmlns:a16="http://schemas.microsoft.com/office/drawing/2014/main" id="{64C3DE9E-8C55-7445-604D-DF48F1197E30}"/>
                             </a:ext>
                           </a:extLst>
                         </pic:cNvPr>
@@ -133,13 +133,13 @@
         <mc:AlternateContent>
           <mc:Choice Requires="cx1">
             <w:drawing>
-              <wp:inline distT="0" distB="0" distL="0" distR="0" wp14:anchorId="555C7320" wp14:editId="56B97441">
+              <wp:inline distT="0" distB="0" distL="0" distR="0" wp14:anchorId="146926B3" wp14:editId="20FE57A7">
                 <wp:extent cx="4572000" cy="2794000"/>
                 <wp:effectExtent l="0" t="0" r="0" b="6350"/>
-                <wp:docPr id="391389968" name="Chart 1">
+                <wp:docPr id="939429595" name="Chart 1">
                   <a:extLst xmlns:a="http://schemas.openxmlformats.org/drawingml/2006/main">
                     <a:ext uri="{FF2B5EF4-FFF2-40B4-BE49-F238E27FC236}">
-                      <a16:creationId xmlns:a16="http://schemas.microsoft.com/office/drawing/2014/main" id="{0524B8BA-3CE7-22DB-8341-2446AC7648B1}"/>
+                      <a16:creationId xmlns:a16="http://schemas.microsoft.com/office/drawing/2014/main" id="{7F4FF864-A5B9-D27F-284E-A01D70F2AA0D}"/>
                     </a:ext>
                   </a:extLst>
                 </wp:docPr>
@@ -154,13 +154,13 @@
           </mc:Choice>
           <mc:Fallback>
             <w:drawing>
-              <wp:inline distT="0" distB="0" distL="0" distR="0" wp14:anchorId="555C7320" wp14:editId="56B97441">
+              <wp:inline distT="0" distB="0" distL="0" distR="0" wp14:anchorId="146926B3" wp14:editId="20FE57A7">
                 <wp:extent cx="4572000" cy="2794000"/>
                 <wp:effectExtent l="0" t="0" r="0" b="6350"/>
-                <wp:docPr id="391389968" name="Chart 1">
+                <wp:docPr id="939429595" name="Chart 1">
                   <a:extLst xmlns:a="http://schemas.openxmlformats.org/drawingml/2006/main">
                     <a:ext uri="{FF2B5EF4-FFF2-40B4-BE49-F238E27FC236}">
-                      <a16:creationId xmlns:a16="http://schemas.microsoft.com/office/drawing/2014/main" id="{0524B8BA-3CE7-22DB-8341-2446AC7648B1}"/>
+                      <a16:creationId xmlns:a16="http://schemas.microsoft.com/office/drawing/2014/main" id="{7F4FF864-A5B9-D27F-284E-A01D70F2AA0D}"/>
                     </a:ext>
                   </a:extLst>
                 </wp:docPr>
@@ -171,10 +171,10 @@
                   <a:graphicData uri="http://schemas.openxmlformats.org/drawingml/2006/picture">
                     <pic:pic xmlns:pic="http://schemas.openxmlformats.org/drawingml/2006/picture">
                       <pic:nvPicPr>
-                        <pic:cNvPr id="391389968" name="Chart 1">
+                        <pic:cNvPr id="939429595" name="Chart 1">
                           <a:extLst>
                             <a:ext uri="{FF2B5EF4-FFF2-40B4-BE49-F238E27FC236}">
-                              <a16:creationId xmlns:a16="http://schemas.microsoft.com/office/drawing/2014/main" id="{0524B8BA-3CE7-22DB-8341-2446AC7648B1}"/>
+                              <a16:creationId xmlns:a16="http://schemas.microsoft.com/office/drawing/2014/main" id="{7F4FF864-A5B9-D27F-284E-A01D70F2AA0D}"/>
                             </a:ext>
                           </a:extLst>
                         </pic:cNvPr>
@@ -184,6 +184,244 @@
                       </pic:nvPicPr>
                       <pic:blipFill>
                         <a:blip r:embed="rId8"/>
+                        <a:stretch>
+                          <a:fillRect/>
+                        </a:stretch>
+                      </pic:blipFill>
+                      <pic:spPr>
+                        <a:xfrm>
+                          <a:off x="0" y="0"/>
+                          <a:ext cx="4572000" cy="2794000"/>
+                        </a:xfrm>
+                        <a:prstGeom prst="rect">
+                          <a:avLst/>
+                        </a:prstGeom>
+                      </pic:spPr>
+                    </pic:pic>
+                  </a:graphicData>
+                </a:graphic>
+              </wp:inline>
+            </w:drawing>
+          </mc:Fallback>
+        </mc:AlternateContent>
+      </w:r>
+    </w:p>
+    <w:p>
+      <w:r>
+        <w:t>Bubble</w:t>
+      </w:r>
+    </w:p>
+    <w:p>
+      <w:r>
+        <w:rPr>
+          <w:noProof/>
+        </w:rPr>
+        <w:drawing>
+          <wp:inline distT="0" distB="0" distL="0" distR="0" wp14:anchorId="3D287910" wp14:editId="54B93660">
+            <wp:extent cx="4572000" cy="2794000"/>
+            <wp:effectExtent l="0" t="0" r="0" b="6350"/>
+            <wp:docPr id="2115522668" name="Chart 1">
+              <a:extLst xmlns:a="http://schemas.openxmlformats.org/drawingml/2006/main">
+                <a:ext uri="{FF2B5EF4-FFF2-40B4-BE49-F238E27FC236}">
+                  <a16:creationId xmlns:a16="http://schemas.microsoft.com/office/drawing/2014/main" id="{CD3C7974-5D32-40C1-DAD3-B285469E64B9}"/>
+                </a:ext>
+              </a:extLst>
+            </wp:docPr>
+            <wp:cNvGraphicFramePr/>
+            <a:graphic xmlns:a="http://schemas.openxmlformats.org/drawingml/2006/main">
+              <a:graphicData uri="http://schemas.openxmlformats.org/drawingml/2006/chart">
+                <c:chart xmlns:c="http://schemas.openxmlformats.org/drawingml/2006/chart" xmlns:r="http://schemas.openxmlformats.org/officeDocument/2006/relationships" r:id="rId9"/>
+              </a:graphicData>
+            </a:graphic>
+          </wp:inline>
+        </w:drawing>
+      </w:r>
+    </w:p>
+    <w:p>
+      <w:r>
+        <w:t>Stock</w:t>
+      </w:r>
+    </w:p>
+    <w:p>
+      <w:r>
+        <w:rPr>
+          <w:noProof/>
+        </w:rPr>
+        <w:lastRenderedPageBreak/>
+        <w:drawing>
+          <wp:inline distT="0" distB="0" distL="0" distR="0" wp14:anchorId="7998C5A4" wp14:editId="74E3212E">
+            <wp:extent cx="4572000" cy="2794000"/>
+            <wp:effectExtent l="0" t="0" r="0" b="6350"/>
+            <wp:docPr id="685993847" name="Chart 1">
+              <a:extLst xmlns:a="http://schemas.openxmlformats.org/drawingml/2006/main">
+                <a:ext uri="{FF2B5EF4-FFF2-40B4-BE49-F238E27FC236}">
+                  <a16:creationId xmlns:a16="http://schemas.microsoft.com/office/drawing/2014/main" id="{AB26A0A3-0010-B89B-86AC-11FE21A709F9}"/>
+                </a:ext>
+              </a:extLst>
+            </wp:docPr>
+            <wp:cNvGraphicFramePr/>
+            <a:graphic xmlns:a="http://schemas.openxmlformats.org/drawingml/2006/main">
+              <a:graphicData uri="http://schemas.openxmlformats.org/drawingml/2006/chart">
+                <c:chart xmlns:c="http://schemas.openxmlformats.org/drawingml/2006/chart" xmlns:r="http://schemas.openxmlformats.org/officeDocument/2006/relationships" r:id="rId10"/>
+              </a:graphicData>
+            </a:graphic>
+          </wp:inline>
+        </w:drawing>
+      </w:r>
+    </w:p>
+    <w:p>
+      <w:proofErr w:type="spellStart"/>
+      <w:r>
+        <w:t>Treemap</w:t>
+      </w:r>
+      <w:proofErr w:type="spellEnd"/>
+    </w:p>
+    <w:p>
+      <w:r>
+        <w:rPr>
+          <w:noProof/>
+        </w:rPr>
+        <mc:AlternateContent>
+          <mc:Choice Requires="cx1">
+            <w:drawing>
+              <wp:inline distT="0" distB="0" distL="0" distR="0" wp14:anchorId="2BB18C0D" wp14:editId="55568BCA">
+                <wp:extent cx="4572000" cy="2794000"/>
+                <wp:effectExtent l="0" t="0" r="0" b="6350"/>
+                <wp:docPr id="1638671509" name="Chart 1">
+                  <a:extLst xmlns:a="http://schemas.openxmlformats.org/drawingml/2006/main">
+                    <a:ext uri="{FF2B5EF4-FFF2-40B4-BE49-F238E27FC236}">
+                      <a16:creationId xmlns:a16="http://schemas.microsoft.com/office/drawing/2014/main" id="{AE1D4A7D-7CC3-085C-6A89-6606737D5056}"/>
+                    </a:ext>
+                  </a:extLst>
+                </wp:docPr>
+                <wp:cNvGraphicFramePr/>
+                <a:graphic xmlns:a="http://schemas.openxmlformats.org/drawingml/2006/main">
+                  <a:graphicData uri="http://schemas.microsoft.com/office/drawing/2014/chartex">
+                    <cx:chart xmlns:cx="http://schemas.microsoft.com/office/drawing/2014/chartex" xmlns:r="http://schemas.openxmlformats.org/officeDocument/2006/relationships" r:id="rId11"/>
+                  </a:graphicData>
+                </a:graphic>
+              </wp:inline>
+            </w:drawing>
+          </mc:Choice>
+          <mc:Fallback>
+            <w:drawing>
+              <wp:inline distT="0" distB="0" distL="0" distR="0" wp14:anchorId="2BB18C0D" wp14:editId="55568BCA">
+                <wp:extent cx="4572000" cy="2794000"/>
+                <wp:effectExtent l="0" t="0" r="0" b="6350"/>
+                <wp:docPr id="1638671509" name="Chart 1">
+                  <a:extLst xmlns:a="http://schemas.openxmlformats.org/drawingml/2006/main">
+                    <a:ext uri="{FF2B5EF4-FFF2-40B4-BE49-F238E27FC236}">
+                      <a16:creationId xmlns:a16="http://schemas.microsoft.com/office/drawing/2014/main" id="{AE1D4A7D-7CC3-085C-6A89-6606737D5056}"/>
+                    </a:ext>
+                  </a:extLst>
+                </wp:docPr>
+                <wp:cNvGraphicFramePr>
+                  <a:graphicFrameLocks xmlns:a="http://schemas.openxmlformats.org/drawingml/2006/main" noGrp="1" noDrilldown="1" noSelect="1" noChangeAspect="1" noMove="1" noResize="1"/>
+                </wp:cNvGraphicFramePr>
+                <a:graphic xmlns:a="http://schemas.openxmlformats.org/drawingml/2006/main">
+                  <a:graphicData uri="http://schemas.openxmlformats.org/drawingml/2006/picture">
+                    <pic:pic xmlns:pic="http://schemas.openxmlformats.org/drawingml/2006/picture">
+                      <pic:nvPicPr>
+                        <pic:cNvPr id="1638671509" name="Chart 1">
+                          <a:extLst>
+                            <a:ext uri="{FF2B5EF4-FFF2-40B4-BE49-F238E27FC236}">
+                              <a16:creationId xmlns:a16="http://schemas.microsoft.com/office/drawing/2014/main" id="{AE1D4A7D-7CC3-085C-6A89-6606737D5056}"/>
+                            </a:ext>
+                          </a:extLst>
+                        </pic:cNvPr>
+                        <pic:cNvPicPr>
+                          <a:picLocks noGrp="1" noRot="1" noChangeAspect="1" noMove="1" noResize="1" noEditPoints="1" noAdjustHandles="1" noChangeArrowheads="1" noChangeShapeType="1"/>
+                        </pic:cNvPicPr>
+                      </pic:nvPicPr>
+                      <pic:blipFill>
+                        <a:blip r:embed="rId12"/>
+                        <a:stretch>
+                          <a:fillRect/>
+                        </a:stretch>
+                      </pic:blipFill>
+                      <pic:spPr>
+                        <a:xfrm>
+                          <a:off x="0" y="0"/>
+                          <a:ext cx="4572000" cy="2794000"/>
+                        </a:xfrm>
+                        <a:prstGeom prst="rect">
+                          <a:avLst/>
+                        </a:prstGeom>
+                      </pic:spPr>
+                    </pic:pic>
+                  </a:graphicData>
+                </a:graphic>
+              </wp:inline>
+            </w:drawing>
+          </mc:Fallback>
+        </mc:AlternateContent>
+      </w:r>
+    </w:p>
+    <w:p>
+      <w:r>
+        <w:t>Sunburst</w:t>
+      </w:r>
+    </w:p>
+    <w:p>
+      <w:r>
+        <w:rPr>
+          <w:noProof/>
+        </w:rPr>
+        <w:lastRenderedPageBreak/>
+        <mc:AlternateContent>
+          <mc:Choice Requires="cx1">
+            <w:drawing>
+              <wp:inline distT="0" distB="0" distL="0" distR="0" wp14:anchorId="1443DA23" wp14:editId="0A1425D8">
+                <wp:extent cx="4572000" cy="2794000"/>
+                <wp:effectExtent l="0" t="0" r="0" b="6350"/>
+                <wp:docPr id="1953686122" name="Chart 1">
+                  <a:extLst xmlns:a="http://schemas.openxmlformats.org/drawingml/2006/main">
+                    <a:ext uri="{FF2B5EF4-FFF2-40B4-BE49-F238E27FC236}">
+                      <a16:creationId xmlns:a16="http://schemas.microsoft.com/office/drawing/2014/main" id="{1A6ACB7F-E49A-0401-D867-4523FE440CA8}"/>
+                    </a:ext>
+                  </a:extLst>
+                </wp:docPr>
+                <wp:cNvGraphicFramePr/>
+                <a:graphic xmlns:a="http://schemas.openxmlformats.org/drawingml/2006/main">
+                  <a:graphicData uri="http://schemas.microsoft.com/office/drawing/2014/chartex">
+                    <cx:chart xmlns:cx="http://schemas.microsoft.com/office/drawing/2014/chartex" xmlns:r="http://schemas.openxmlformats.org/officeDocument/2006/relationships" r:id="rId13"/>
+                  </a:graphicData>
+                </a:graphic>
+              </wp:inline>
+            </w:drawing>
+          </mc:Choice>
+          <mc:Fallback>
+            <w:drawing>
+              <wp:inline distT="0" distB="0" distL="0" distR="0" wp14:anchorId="1443DA23" wp14:editId="0A1425D8">
+                <wp:extent cx="4572000" cy="2794000"/>
+                <wp:effectExtent l="0" t="0" r="0" b="6350"/>
+                <wp:docPr id="1953686122" name="Chart 1">
+                  <a:extLst xmlns:a="http://schemas.openxmlformats.org/drawingml/2006/main">
+                    <a:ext uri="{FF2B5EF4-FFF2-40B4-BE49-F238E27FC236}">
+                      <a16:creationId xmlns:a16="http://schemas.microsoft.com/office/drawing/2014/main" id="{1A6ACB7F-E49A-0401-D867-4523FE440CA8}"/>
+                    </a:ext>
+                  </a:extLst>
+                </wp:docPr>
+                <wp:cNvGraphicFramePr>
+                  <a:graphicFrameLocks xmlns:a="http://schemas.openxmlformats.org/drawingml/2006/main" noGrp="1" noDrilldown="1" noSelect="1" noChangeAspect="1" noMove="1" noResize="1"/>
+                </wp:cNvGraphicFramePr>
+                <a:graphic xmlns:a="http://schemas.openxmlformats.org/drawingml/2006/main">
+                  <a:graphicData uri="http://schemas.openxmlformats.org/drawingml/2006/picture">
+                    <pic:pic xmlns:pic="http://schemas.openxmlformats.org/drawingml/2006/picture">
+                      <pic:nvPicPr>
+                        <pic:cNvPr id="1953686122" name="Chart 1">
+                          <a:extLst>
+                            <a:ext uri="{FF2B5EF4-FFF2-40B4-BE49-F238E27FC236}">
+                              <a16:creationId xmlns:a16="http://schemas.microsoft.com/office/drawing/2014/main" id="{1A6ACB7F-E49A-0401-D867-4523FE440CA8}"/>
+                            </a:ext>
+                          </a:extLst>
+                        </pic:cNvPr>
+                        <pic:cNvPicPr>
+                          <a:picLocks noGrp="1" noRot="1" noChangeAspect="1" noMove="1" noResize="1" noEditPoints="1" noAdjustHandles="1" noChangeArrowheads="1" noChangeShapeType="1"/>
+                        </pic:cNvPicPr>
+                      </pic:nvPicPr>
+                      <pic:blipFill>
+                        <a:blip r:embed="rId14"/>
                         <a:stretch>
                           <a:fillRect/>
                         </a:stretch>
@@ -625,7 +863,7 @@
     <w:link w:val="Heading1Char"/>
     <w:uiPriority w:val="9"/>
     <w:qFormat/>
-    <w:rsid w:val="00D16989"/>
+    <w:rsid w:val="0007328B"/>
     <w:pPr>
       <w:keepNext/>
       <w:keepLines/>
@@ -648,7 +886,7 @@
     <w:semiHidden/>
     <w:unhideWhenUsed/>
     <w:qFormat/>
-    <w:rsid w:val="00D16989"/>
+    <w:rsid w:val="0007328B"/>
     <w:pPr>
       <w:keepNext/>
       <w:keepLines/>
@@ -671,7 +909,7 @@
     <w:semiHidden/>
     <w:unhideWhenUsed/>
     <w:qFormat/>
-    <w:rsid w:val="00D16989"/>
+    <w:rsid w:val="0007328B"/>
     <w:pPr>
       <w:keepNext/>
       <w:keepLines/>
@@ -694,7 +932,7 @@
     <w:semiHidden/>
     <w:unhideWhenUsed/>
     <w:qFormat/>
-    <w:rsid w:val="00D16989"/>
+    <w:rsid w:val="0007328B"/>
     <w:pPr>
       <w:keepNext/>
       <w:keepLines/>
@@ -717,7 +955,7 @@
     <w:semiHidden/>
     <w:unhideWhenUsed/>
     <w:qFormat/>
-    <w:rsid w:val="00D16989"/>
+    <w:rsid w:val="0007328B"/>
     <w:pPr>
       <w:keepNext/>
       <w:keepLines/>
@@ -738,7 +976,7 @@
     <w:semiHidden/>
     <w:unhideWhenUsed/>
     <w:qFormat/>
-    <w:rsid w:val="00D16989"/>
+    <w:rsid w:val="0007328B"/>
     <w:pPr>
       <w:keepNext/>
       <w:keepLines/>
@@ -761,7 +999,7 @@
     <w:semiHidden/>
     <w:unhideWhenUsed/>
     <w:qFormat/>
-    <w:rsid w:val="00D16989"/>
+    <w:rsid w:val="0007328B"/>
     <w:pPr>
       <w:keepNext/>
       <w:keepLines/>
@@ -782,7 +1020,7 @@
     <w:semiHidden/>
     <w:unhideWhenUsed/>
     <w:qFormat/>
-    <w:rsid w:val="00D16989"/>
+    <w:rsid w:val="0007328B"/>
     <w:pPr>
       <w:keepNext/>
       <w:keepLines/>
@@ -805,7 +1043,7 @@
     <w:semiHidden/>
     <w:unhideWhenUsed/>
     <w:qFormat/>
-    <w:rsid w:val="00D16989"/>
+    <w:rsid w:val="0007328B"/>
     <w:pPr>
       <w:keepNext/>
       <w:keepLines/>
@@ -849,7 +1087,7 @@
     <w:basedOn w:val="DefaultParagraphFont"/>
     <w:link w:val="Heading1"/>
     <w:uiPriority w:val="9"/>
-    <w:rsid w:val="00D16989"/>
+    <w:rsid w:val="0007328B"/>
     <w:rPr>
       <w:rFonts w:asciiTheme="majorHAnsi" w:eastAsiaTheme="majorEastAsia" w:hAnsiTheme="majorHAnsi" w:cstheme="majorBidi"/>
       <w:color w:val="2F5496" w:themeColor="accent1" w:themeShade="BF"/>
@@ -863,7 +1101,7 @@
     <w:link w:val="Heading2"/>
     <w:uiPriority w:val="9"/>
     <w:semiHidden/>
-    <w:rsid w:val="00D16989"/>
+    <w:rsid w:val="0007328B"/>
     <w:rPr>
       <w:rFonts w:asciiTheme="majorHAnsi" w:eastAsiaTheme="majorEastAsia" w:hAnsiTheme="majorHAnsi" w:cstheme="majorBidi"/>
       <w:color w:val="2F5496" w:themeColor="accent1" w:themeShade="BF"/>
@@ -877,7 +1115,7 @@
     <w:link w:val="Heading3"/>
     <w:uiPriority w:val="9"/>
     <w:semiHidden/>
-    <w:rsid w:val="00D16989"/>
+    <w:rsid w:val="0007328B"/>
     <w:rPr>
       <w:rFonts w:eastAsiaTheme="majorEastAsia" w:cstheme="majorBidi"/>
       <w:color w:val="2F5496" w:themeColor="accent1" w:themeShade="BF"/>
@@ -891,7 +1129,7 @@
     <w:link w:val="Heading4"/>
     <w:uiPriority w:val="9"/>
     <w:semiHidden/>
-    <w:rsid w:val="00D16989"/>
+    <w:rsid w:val="0007328B"/>
     <w:rPr>
       <w:rFonts w:eastAsiaTheme="majorEastAsia" w:cstheme="majorBidi"/>
       <w:i/>
@@ -905,7 +1143,7 @@
     <w:link w:val="Heading5"/>
     <w:uiPriority w:val="9"/>
     <w:semiHidden/>
-    <w:rsid w:val="00D16989"/>
+    <w:rsid w:val="0007328B"/>
     <w:rPr>
       <w:rFonts w:eastAsiaTheme="majorEastAsia" w:cstheme="majorBidi"/>
       <w:color w:val="2F5496" w:themeColor="accent1" w:themeShade="BF"/>
@@ -917,7 +1155,7 @@
     <w:link w:val="Heading6"/>
     <w:uiPriority w:val="9"/>
     <w:semiHidden/>
-    <w:rsid w:val="00D16989"/>
+    <w:rsid w:val="0007328B"/>
     <w:rPr>
       <w:rFonts w:eastAsiaTheme="majorEastAsia" w:cstheme="majorBidi"/>
       <w:i/>
@@ -931,7 +1169,7 @@
     <w:link w:val="Heading7"/>
     <w:uiPriority w:val="9"/>
     <w:semiHidden/>
-    <w:rsid w:val="00D16989"/>
+    <w:rsid w:val="0007328B"/>
     <w:rPr>
       <w:rFonts w:eastAsiaTheme="majorEastAsia" w:cstheme="majorBidi"/>
       <w:color w:val="595959" w:themeColor="text1" w:themeTint="A6"/>
@@ -943,7 +1181,7 @@
     <w:link w:val="Heading8"/>
     <w:uiPriority w:val="9"/>
     <w:semiHidden/>
-    <w:rsid w:val="00D16989"/>
+    <w:rsid w:val="0007328B"/>
     <w:rPr>
       <w:rFonts w:eastAsiaTheme="majorEastAsia" w:cstheme="majorBidi"/>
       <w:i/>
@@ -957,7 +1195,7 @@
     <w:link w:val="Heading9"/>
     <w:uiPriority w:val="9"/>
     <w:semiHidden/>
-    <w:rsid w:val="00D16989"/>
+    <w:rsid w:val="0007328B"/>
     <w:rPr>
       <w:rFonts w:eastAsiaTheme="majorEastAsia" w:cstheme="majorBidi"/>
       <w:color w:val="272727" w:themeColor="text1" w:themeTint="D8"/>
@@ -970,7 +1208,7 @@
     <w:link w:val="TitleChar"/>
     <w:uiPriority w:val="10"/>
     <w:qFormat/>
-    <w:rsid w:val="00D16989"/>
+    <w:rsid w:val="0007328B"/>
     <w:pPr>
       <w:spacing w:after="80" w:line="240" w:lineRule="auto"/>
       <w:contextualSpacing/>
@@ -988,7 +1226,7 @@
     <w:basedOn w:val="DefaultParagraphFont"/>
     <w:link w:val="Title"/>
     <w:uiPriority w:val="10"/>
-    <w:rsid w:val="00D16989"/>
+    <w:rsid w:val="0007328B"/>
     <w:rPr>
       <w:rFonts w:asciiTheme="majorHAnsi" w:eastAsiaTheme="majorEastAsia" w:hAnsiTheme="majorHAnsi" w:cstheme="majorBidi"/>
       <w:spacing w:val="-10"/>
@@ -1004,7 +1242,7 @@
     <w:link w:val="SubtitleChar"/>
     <w:uiPriority w:val="11"/>
     <w:qFormat/>
-    <w:rsid w:val="00D16989"/>
+    <w:rsid w:val="0007328B"/>
     <w:pPr>
       <w:numPr>
         <w:ilvl w:val="1"/>
@@ -1023,7 +1261,7 @@
     <w:basedOn w:val="DefaultParagraphFont"/>
     <w:link w:val="Subtitle"/>
     <w:uiPriority w:val="11"/>
-    <w:rsid w:val="00D16989"/>
+    <w:rsid w:val="0007328B"/>
     <w:rPr>
       <w:rFonts w:eastAsiaTheme="majorEastAsia" w:cstheme="majorBidi"/>
       <w:color w:val="595959" w:themeColor="text1" w:themeTint="A6"/>
@@ -1039,7 +1277,7 @@
     <w:link w:val="QuoteChar"/>
     <w:uiPriority w:val="29"/>
     <w:qFormat/>
-    <w:rsid w:val="00D16989"/>
+    <w:rsid w:val="0007328B"/>
     <w:pPr>
       <w:spacing w:before="160"/>
       <w:jc w:val="center"/>
@@ -1055,7 +1293,7 @@
     <w:basedOn w:val="DefaultParagraphFont"/>
     <w:link w:val="Quote"/>
     <w:uiPriority w:val="29"/>
-    <w:rsid w:val="00D16989"/>
+    <w:rsid w:val="0007328B"/>
     <w:rPr>
       <w:i/>
       <w:iCs/>
@@ -1067,7 +1305,7 @@
     <w:basedOn w:val="Normal"/>
     <w:uiPriority w:val="34"/>
     <w:qFormat/>
-    <w:rsid w:val="00D16989"/>
+    <w:rsid w:val="0007328B"/>
     <w:pPr>
       <w:ind w:left="720"/>
       <w:contextualSpacing/>
@@ -1078,7 +1316,7 @@
     <w:basedOn w:val="DefaultParagraphFont"/>
     <w:uiPriority w:val="21"/>
     <w:qFormat/>
-    <w:rsid w:val="00D16989"/>
+    <w:rsid w:val="0007328B"/>
     <w:rPr>
       <w:i/>
       <w:iCs/>
@@ -1092,7 +1330,7 @@
     <w:link w:val="IntenseQuoteChar"/>
     <w:uiPriority w:val="30"/>
     <w:qFormat/>
-    <w:rsid w:val="00D16989"/>
+    <w:rsid w:val="0007328B"/>
     <w:pPr>
       <w:pBdr>
         <w:top w:val="single" w:sz="4" w:space="10" w:color="2F5496" w:themeColor="accent1" w:themeShade="BF"/>
@@ -1113,7 +1351,7 @@
     <w:basedOn w:val="DefaultParagraphFont"/>
     <w:link w:val="IntenseQuote"/>
     <w:uiPriority w:val="30"/>
-    <w:rsid w:val="00D16989"/>
+    <w:rsid w:val="0007328B"/>
     <w:rPr>
       <w:i/>
       <w:iCs/>
@@ -1125,7 +1363,7 @@
     <w:basedOn w:val="DefaultParagraphFont"/>
     <w:uiPriority w:val="32"/>
     <w:qFormat/>
-    <w:rsid w:val="00D16989"/>
+    <w:rsid w:val="0007328B"/>
     <w:rPr>
       <w:b/>
       <w:bCs/>
@@ -1280,7 +1518,7 @@
           </c:val>
           <c:extLst>
             <c:ext xmlns:c16="http://schemas.microsoft.com/office/drawing/2014/chart" uri="{C3380CC4-5D6E-409C-BE32-E72D297353CC}">
-              <c16:uniqueId val="{00000000-5893-4469-B430-D0672CF826C8}"/>
+              <c16:uniqueId val="{00000000-63C1-4BBC-96CC-562AE5BE25EC}"/>
             </c:ext>
           </c:extLst>
         </c:ser>
@@ -1294,8 +1532,8 @@
         </c:dLbls>
         <c:gapWidth val="219"/>
         <c:overlap val="-27"/>
-        <c:axId val="769643039"/>
-        <c:axId val="361160688"/>
+        <c:axId val="532669040"/>
+        <c:axId val="1704377872"/>
       </c:barChart>
       <c:lineChart>
         <c:grouping val="standard"/>
@@ -1382,7 +1620,7 @@
           <c:smooth val="0"/>
           <c:extLst>
             <c:ext xmlns:c16="http://schemas.microsoft.com/office/drawing/2014/chart" uri="{C3380CC4-5D6E-409C-BE32-E72D297353CC}">
-              <c16:uniqueId val="{00000001-5893-4469-B430-D0672CF826C8}"/>
+              <c16:uniqueId val="{00000001-63C1-4BBC-96CC-562AE5BE25EC}"/>
             </c:ext>
           </c:extLst>
         </c:ser>
@@ -1396,11 +1634,11 @@
         </c:dLbls>
         <c:marker val="1"/>
         <c:smooth val="0"/>
-        <c:axId val="769649535"/>
-        <c:axId val="361152528"/>
+        <c:axId val="532667184"/>
+        <c:axId val="1704377392"/>
       </c:lineChart>
       <c:catAx>
-        <c:axId val="769643039"/>
+        <c:axId val="532669040"/>
         <c:scaling>
           <c:orientation val="minMax"/>
         </c:scaling>
@@ -1443,7 +1681,7 @@
             <a:endParaRPr lang="en-US"/>
           </a:p>
         </c:txPr>
-        <c:crossAx val="361160688"/>
+        <c:crossAx val="1704377872"/>
         <c:crosses val="autoZero"/>
         <c:auto val="1"/>
         <c:lblAlgn val="ctr"/>
@@ -1451,7 +1689,7 @@
         <c:noMultiLvlLbl val="0"/>
       </c:catAx>
       <c:valAx>
-        <c:axId val="361160688"/>
+        <c:axId val="1704377872"/>
         <c:scaling>
           <c:orientation val="minMax"/>
         </c:scaling>
@@ -1502,12 +1740,12 @@
             <a:endParaRPr lang="en-US"/>
           </a:p>
         </c:txPr>
-        <c:crossAx val="769643039"/>
+        <c:crossAx val="532669040"/>
         <c:crosses val="autoZero"/>
         <c:crossBetween val="between"/>
       </c:valAx>
       <c:valAx>
-        <c:axId val="361152528"/>
+        <c:axId val="1704377392"/>
         <c:scaling>
           <c:orientation val="minMax"/>
         </c:scaling>
@@ -1544,12 +1782,12 @@
             <a:endParaRPr lang="en-US"/>
           </a:p>
         </c:txPr>
-        <c:crossAx val="769649535"/>
+        <c:crossAx val="532667184"/>
         <c:crosses val="max"/>
         <c:crossBetween val="between"/>
       </c:valAx>
       <c:catAx>
-        <c:axId val="769649535"/>
+        <c:axId val="532667184"/>
         <c:scaling>
           <c:orientation val="minMax"/>
         </c:scaling>
@@ -1559,13 +1797,974 @@
         <c:majorTickMark val="out"/>
         <c:minorTickMark val="none"/>
         <c:tickLblPos val="nextTo"/>
-        <c:crossAx val="361152528"/>
+        <c:crossAx val="1704377392"/>
         <c:crosses val="autoZero"/>
         <c:auto val="1"/>
         <c:lblAlgn val="ctr"/>
         <c:lblOffset val="100"/>
         <c:noMultiLvlLbl val="0"/>
       </c:catAx>
+      <c:spPr>
+        <a:noFill/>
+        <a:ln>
+          <a:noFill/>
+        </a:ln>
+        <a:effectLst/>
+      </c:spPr>
+    </c:plotArea>
+    <c:legend>
+      <c:legendPos val="b"/>
+      <c:overlay val="0"/>
+      <c:spPr>
+        <a:noFill/>
+        <a:ln>
+          <a:noFill/>
+        </a:ln>
+        <a:effectLst/>
+      </c:spPr>
+      <c:txPr>
+        <a:bodyPr rot="0" spcFirstLastPara="1" vertOverflow="ellipsis" vert="horz" wrap="square" anchor="ctr" anchorCtr="1"/>
+        <a:lstStyle/>
+        <a:p>
+          <a:pPr>
+            <a:defRPr sz="900" b="0" i="0" u="none" strike="noStrike" kern="1200" baseline="0">
+              <a:solidFill>
+                <a:schemeClr val="tx1">
+                  <a:lumMod val="65000"/>
+                  <a:lumOff val="35000"/>
+                </a:schemeClr>
+              </a:solidFill>
+              <a:latin typeface="+mn-lt"/>
+              <a:ea typeface="+mn-ea"/>
+              <a:cs typeface="+mn-cs"/>
+            </a:defRPr>
+          </a:pPr>
+          <a:endParaRPr lang="en-US"/>
+        </a:p>
+      </c:txPr>
+    </c:legend>
+    <c:plotVisOnly val="1"/>
+    <c:dispBlanksAs val="gap"/>
+    <c:showDLblsOverMax val="0"/>
+    <c:extLst>
+      <c:ext xmlns:c16r3="http://schemas.microsoft.com/office/drawing/2017/03/chart" uri="{56B9EC1D-385E-4148-901F-78D8002777C0}">
+        <c16r3:dataDisplayOptions16>
+          <c16r3:dispNaAsBlank val="1"/>
+        </c16r3:dataDisplayOptions16>
+      </c:ext>
+    </c:extLst>
+  </c:chart>
+  <c:spPr>
+    <a:solidFill>
+      <a:schemeClr val="bg1"/>
+    </a:solidFill>
+    <a:ln w="9525" cap="flat" cmpd="sng" algn="ctr">
+      <a:solidFill>
+        <a:schemeClr val="tx1">
+          <a:lumMod val="15000"/>
+          <a:lumOff val="85000"/>
+        </a:schemeClr>
+      </a:solidFill>
+      <a:round/>
+    </a:ln>
+    <a:effectLst/>
+  </c:spPr>
+  <c:txPr>
+    <a:bodyPr/>
+    <a:lstStyle/>
+    <a:p>
+      <a:pPr>
+        <a:defRPr/>
+      </a:pPr>
+      <a:endParaRPr lang="en-US"/>
+    </a:p>
+  </c:txPr>
+  <c:externalData r:id="rId3">
+    <c:autoUpdate val="0"/>
+  </c:externalData>
+</c:chartSpace>
+</file>
+
+<file path=word/charts/chart2.xml><?xml version="1.0" encoding="utf-8"?>
+<c:chartSpace xmlns:c="http://schemas.openxmlformats.org/drawingml/2006/chart" xmlns:a="http://schemas.openxmlformats.org/drawingml/2006/main" xmlns:r="http://schemas.openxmlformats.org/officeDocument/2006/relationships" xmlns:c16r2="http://schemas.microsoft.com/office/drawing/2015/06/chart">
+  <c:date1904 val="0"/>
+  <c:lang val="en-US"/>
+  <c:roundedCorners val="0"/>
+  <mc:AlternateContent xmlns:mc="http://schemas.openxmlformats.org/markup-compatibility/2006">
+    <mc:Choice xmlns:c14="http://schemas.microsoft.com/office/drawing/2007/8/2/chart" Requires="c14">
+      <c14:style val="102"/>
+    </mc:Choice>
+    <mc:Fallback>
+      <c:style val="2"/>
+    </mc:Fallback>
+  </mc:AlternateContent>
+  <c:chart>
+    <c:title>
+      <c:tx>
+        <c:rich>
+          <a:bodyPr rot="0" spcFirstLastPara="1" vertOverflow="ellipsis" vert="horz" wrap="square" anchor="ctr" anchorCtr="1"/>
+          <a:lstStyle/>
+          <a:p>
+            <a:pPr>
+              <a:defRPr sz="1400" b="0" i="0" u="none" strike="noStrike" kern="1200" spc="0" baseline="0">
+                <a:solidFill>
+                  <a:schemeClr val="tx1">
+                    <a:lumMod val="65000"/>
+                    <a:lumOff val="35000"/>
+                  </a:schemeClr>
+                </a:solidFill>
+                <a:latin typeface="+mn-lt"/>
+                <a:ea typeface="+mn-ea"/>
+                <a:cs typeface="+mn-cs"/>
+              </a:defRPr>
+            </a:pPr>
+            <a:r>
+              <a:rPr lang="en-US"/>
+              <a:t>Bubbles</a:t>
+            </a:r>
+          </a:p>
+        </c:rich>
+      </c:tx>
+      <c:overlay val="0"/>
+      <c:spPr>
+        <a:noFill/>
+        <a:ln>
+          <a:noFill/>
+        </a:ln>
+        <a:effectLst/>
+      </c:spPr>
+      <c:txPr>
+        <a:bodyPr rot="0" spcFirstLastPara="1" vertOverflow="ellipsis" vert="horz" wrap="square" anchor="ctr" anchorCtr="1"/>
+        <a:lstStyle/>
+        <a:p>
+          <a:pPr>
+            <a:defRPr sz="1400" b="0" i="0" u="none" strike="noStrike" kern="1200" spc="0" baseline="0">
+              <a:solidFill>
+                <a:schemeClr val="tx1">
+                  <a:lumMod val="65000"/>
+                  <a:lumOff val="35000"/>
+                </a:schemeClr>
+              </a:solidFill>
+              <a:latin typeface="+mn-lt"/>
+              <a:ea typeface="+mn-ea"/>
+              <a:cs typeface="+mn-cs"/>
+            </a:defRPr>
+          </a:pPr>
+          <a:endParaRPr lang="en-US"/>
+        </a:p>
+      </c:txPr>
+    </c:title>
+    <c:autoTitleDeleted val="0"/>
+    <c:plotArea>
+      <c:layout/>
+      <c:bubbleChart>
+        <c:varyColors val="0"/>
+        <c:ser>
+          <c:idx val="0"/>
+          <c:order val="0"/>
+          <c:tx>
+            <c:v>Points</c:v>
+          </c:tx>
+          <c:spPr>
+            <a:solidFill>
+              <a:schemeClr val="accent1">
+                <a:alpha val="75000"/>
+              </a:schemeClr>
+            </a:solidFill>
+            <a:ln w="25400">
+              <a:noFill/>
+            </a:ln>
+            <a:effectLst/>
+          </c:spPr>
+          <c:invertIfNegative val="0"/>
+          <c:xVal>
+            <c:numRef>
+              <c:f>Sheet1!$J$2:$J$5</c:f>
+              <c:numCache>
+                <c:formatCode>General</c:formatCode>
+                <c:ptCount val="4"/>
+                <c:pt idx="0">
+                  <c:v>1</c:v>
+                </c:pt>
+                <c:pt idx="1">
+                  <c:v>2</c:v>
+                </c:pt>
+                <c:pt idx="2">
+                  <c:v>3</c:v>
+                </c:pt>
+                <c:pt idx="3">
+                  <c:v>4</c:v>
+                </c:pt>
+              </c:numCache>
+            </c:numRef>
+          </c:xVal>
+          <c:yVal>
+            <c:numRef>
+              <c:f>Sheet1!$K$2:$K$5</c:f>
+              <c:numCache>
+                <c:formatCode>General</c:formatCode>
+                <c:ptCount val="4"/>
+                <c:pt idx="0">
+                  <c:v>3</c:v>
+                </c:pt>
+                <c:pt idx="1">
+                  <c:v>5</c:v>
+                </c:pt>
+                <c:pt idx="2">
+                  <c:v>4</c:v>
+                </c:pt>
+                <c:pt idx="3">
+                  <c:v>8</c:v>
+                </c:pt>
+              </c:numCache>
+            </c:numRef>
+          </c:yVal>
+          <c:bubbleSize>
+            <c:numRef>
+              <c:f>Sheet1!$L$2:$L$5</c:f>
+              <c:numCache>
+                <c:formatCode>General</c:formatCode>
+                <c:ptCount val="4"/>
+                <c:pt idx="0">
+                  <c:v>5</c:v>
+                </c:pt>
+                <c:pt idx="1">
+                  <c:v>10</c:v>
+                </c:pt>
+                <c:pt idx="2">
+                  <c:v>3</c:v>
+                </c:pt>
+                <c:pt idx="3">
+                  <c:v>8</c:v>
+                </c:pt>
+              </c:numCache>
+            </c:numRef>
+          </c:bubbleSize>
+          <c:bubble3D val="0"/>
+          <c:extLst>
+            <c:ext xmlns:c16="http://schemas.microsoft.com/office/drawing/2014/chart" uri="{C3380CC4-5D6E-409C-BE32-E72D297353CC}">
+              <c16:uniqueId val="{00000000-83DE-4EEF-A91F-B06186D1BC7C}"/>
+            </c:ext>
+          </c:extLst>
+        </c:ser>
+        <c:dLbls>
+          <c:showLegendKey val="0"/>
+          <c:showVal val="0"/>
+          <c:showCatName val="0"/>
+          <c:showSerName val="0"/>
+          <c:showPercent val="0"/>
+          <c:showBubbleSize val="0"/>
+        </c:dLbls>
+        <c:bubbleScale val="100"/>
+        <c:showNegBubbles val="0"/>
+        <c:axId val="894338575"/>
+        <c:axId val="1704367792"/>
+      </c:bubbleChart>
+      <c:valAx>
+        <c:axId val="894338575"/>
+        <c:scaling>
+          <c:orientation val="minMax"/>
+        </c:scaling>
+        <c:delete val="0"/>
+        <c:axPos val="b"/>
+        <c:majorGridlines>
+          <c:spPr>
+            <a:ln w="9525" cap="flat" cmpd="sng" algn="ctr">
+              <a:solidFill>
+                <a:schemeClr val="tx1">
+                  <a:lumMod val="15000"/>
+                  <a:lumOff val="85000"/>
+                </a:schemeClr>
+              </a:solidFill>
+              <a:round/>
+            </a:ln>
+            <a:effectLst/>
+          </c:spPr>
+        </c:majorGridlines>
+        <c:numFmt formatCode="General" sourceLinked="1"/>
+        <c:majorTickMark val="none"/>
+        <c:minorTickMark val="none"/>
+        <c:tickLblPos val="nextTo"/>
+        <c:spPr>
+          <a:noFill/>
+          <a:ln w="9525" cap="flat" cmpd="sng" algn="ctr">
+            <a:solidFill>
+              <a:schemeClr val="tx1">
+                <a:lumMod val="25000"/>
+                <a:lumOff val="75000"/>
+              </a:schemeClr>
+            </a:solidFill>
+            <a:round/>
+          </a:ln>
+          <a:effectLst/>
+        </c:spPr>
+        <c:txPr>
+          <a:bodyPr rot="-60000000" spcFirstLastPara="1" vertOverflow="ellipsis" vert="horz" wrap="square" anchor="ctr" anchorCtr="1"/>
+          <a:lstStyle/>
+          <a:p>
+            <a:pPr>
+              <a:defRPr sz="900" b="0" i="0" u="none" strike="noStrike" kern="1200" baseline="0">
+                <a:solidFill>
+                  <a:schemeClr val="tx1">
+                    <a:lumMod val="65000"/>
+                    <a:lumOff val="35000"/>
+                  </a:schemeClr>
+                </a:solidFill>
+                <a:latin typeface="+mn-lt"/>
+                <a:ea typeface="+mn-ea"/>
+                <a:cs typeface="+mn-cs"/>
+              </a:defRPr>
+            </a:pPr>
+            <a:endParaRPr lang="en-US"/>
+          </a:p>
+        </c:txPr>
+        <c:crossAx val="1704367792"/>
+        <c:crosses val="autoZero"/>
+        <c:crossBetween val="midCat"/>
+      </c:valAx>
+      <c:valAx>
+        <c:axId val="1704367792"/>
+        <c:scaling>
+          <c:orientation val="minMax"/>
+        </c:scaling>
+        <c:delete val="0"/>
+        <c:axPos val="l"/>
+        <c:majorGridlines>
+          <c:spPr>
+            <a:ln w="9525" cap="flat" cmpd="sng" algn="ctr">
+              <a:solidFill>
+                <a:schemeClr val="tx1">
+                  <a:lumMod val="15000"/>
+                  <a:lumOff val="85000"/>
+                </a:schemeClr>
+              </a:solidFill>
+              <a:round/>
+            </a:ln>
+            <a:effectLst/>
+          </c:spPr>
+        </c:majorGridlines>
+        <c:numFmt formatCode="General" sourceLinked="1"/>
+        <c:majorTickMark val="none"/>
+        <c:minorTickMark val="none"/>
+        <c:tickLblPos val="nextTo"/>
+        <c:spPr>
+          <a:noFill/>
+          <a:ln w="9525" cap="flat" cmpd="sng" algn="ctr">
+            <a:solidFill>
+              <a:schemeClr val="tx1">
+                <a:lumMod val="25000"/>
+                <a:lumOff val="75000"/>
+              </a:schemeClr>
+            </a:solidFill>
+            <a:round/>
+          </a:ln>
+          <a:effectLst/>
+        </c:spPr>
+        <c:txPr>
+          <a:bodyPr rot="-60000000" spcFirstLastPara="1" vertOverflow="ellipsis" vert="horz" wrap="square" anchor="ctr" anchorCtr="1"/>
+          <a:lstStyle/>
+          <a:p>
+            <a:pPr>
+              <a:defRPr sz="900" b="0" i="0" u="none" strike="noStrike" kern="1200" baseline="0">
+                <a:solidFill>
+                  <a:schemeClr val="tx1">
+                    <a:lumMod val="65000"/>
+                    <a:lumOff val="35000"/>
+                  </a:schemeClr>
+                </a:solidFill>
+                <a:latin typeface="+mn-lt"/>
+                <a:ea typeface="+mn-ea"/>
+                <a:cs typeface="+mn-cs"/>
+              </a:defRPr>
+            </a:pPr>
+            <a:endParaRPr lang="en-US"/>
+          </a:p>
+        </c:txPr>
+        <c:crossAx val="894338575"/>
+        <c:crosses val="autoZero"/>
+        <c:crossBetween val="midCat"/>
+      </c:valAx>
+      <c:spPr>
+        <a:noFill/>
+        <a:ln>
+          <a:noFill/>
+        </a:ln>
+        <a:effectLst/>
+      </c:spPr>
+    </c:plotArea>
+    <c:plotVisOnly val="1"/>
+    <c:dispBlanksAs val="gap"/>
+    <c:showDLblsOverMax val="0"/>
+    <c:extLst>
+      <c:ext xmlns:c16r3="http://schemas.microsoft.com/office/drawing/2017/03/chart" uri="{56B9EC1D-385E-4148-901F-78D8002777C0}">
+        <c16r3:dataDisplayOptions16>
+          <c16r3:dispNaAsBlank val="1"/>
+        </c16r3:dataDisplayOptions16>
+      </c:ext>
+    </c:extLst>
+  </c:chart>
+  <c:spPr>
+    <a:solidFill>
+      <a:schemeClr val="bg1"/>
+    </a:solidFill>
+    <a:ln w="9525" cap="flat" cmpd="sng" algn="ctr">
+      <a:solidFill>
+        <a:schemeClr val="tx1">
+          <a:lumMod val="15000"/>
+          <a:lumOff val="85000"/>
+        </a:schemeClr>
+      </a:solidFill>
+      <a:round/>
+    </a:ln>
+    <a:effectLst/>
+  </c:spPr>
+  <c:txPr>
+    <a:bodyPr/>
+    <a:lstStyle/>
+    <a:p>
+      <a:pPr>
+        <a:defRPr/>
+      </a:pPr>
+      <a:endParaRPr lang="en-US"/>
+    </a:p>
+  </c:txPr>
+  <c:externalData r:id="rId3">
+    <c:autoUpdate val="0"/>
+  </c:externalData>
+</c:chartSpace>
+</file>
+
+<file path=word/charts/chart3.xml><?xml version="1.0" encoding="utf-8"?>
+<c:chartSpace xmlns:c="http://schemas.openxmlformats.org/drawingml/2006/chart" xmlns:a="http://schemas.openxmlformats.org/drawingml/2006/main" xmlns:r="http://schemas.openxmlformats.org/officeDocument/2006/relationships" xmlns:c16r2="http://schemas.microsoft.com/office/drawing/2015/06/chart">
+  <c:date1904 val="0"/>
+  <c:lang val="en-US"/>
+  <c:roundedCorners val="0"/>
+  <mc:AlternateContent xmlns:mc="http://schemas.openxmlformats.org/markup-compatibility/2006">
+    <mc:Choice xmlns:c14="http://schemas.microsoft.com/office/drawing/2007/8/2/chart" Requires="c14">
+      <c14:style val="102"/>
+    </mc:Choice>
+    <mc:Fallback>
+      <c:style val="2"/>
+    </mc:Fallback>
+  </mc:AlternateContent>
+  <c:chart>
+    <c:title>
+      <c:tx>
+        <c:rich>
+          <a:bodyPr rot="0" spcFirstLastPara="1" vertOverflow="ellipsis" vert="horz" wrap="square" anchor="ctr" anchorCtr="1"/>
+          <a:lstStyle/>
+          <a:p>
+            <a:pPr>
+              <a:defRPr sz="1400" b="0" i="0" u="none" strike="noStrike" kern="1200" spc="0" baseline="0">
+                <a:solidFill>
+                  <a:schemeClr val="tx1">
+                    <a:lumMod val="65000"/>
+                    <a:lumOff val="35000"/>
+                  </a:schemeClr>
+                </a:solidFill>
+                <a:latin typeface="+mn-lt"/>
+                <a:ea typeface="+mn-ea"/>
+                <a:cs typeface="+mn-cs"/>
+              </a:defRPr>
+            </a:pPr>
+            <a:r>
+              <a:rPr lang="en-US"/>
+              <a:t>Prices</a:t>
+            </a:r>
+          </a:p>
+        </c:rich>
+      </c:tx>
+      <c:overlay val="0"/>
+      <c:spPr>
+        <a:noFill/>
+        <a:ln>
+          <a:noFill/>
+        </a:ln>
+        <a:effectLst/>
+      </c:spPr>
+      <c:txPr>
+        <a:bodyPr rot="0" spcFirstLastPara="1" vertOverflow="ellipsis" vert="horz" wrap="square" anchor="ctr" anchorCtr="1"/>
+        <a:lstStyle/>
+        <a:p>
+          <a:pPr>
+            <a:defRPr sz="1400" b="0" i="0" u="none" strike="noStrike" kern="1200" spc="0" baseline="0">
+              <a:solidFill>
+                <a:schemeClr val="tx1">
+                  <a:lumMod val="65000"/>
+                  <a:lumOff val="35000"/>
+                </a:schemeClr>
+              </a:solidFill>
+              <a:latin typeface="+mn-lt"/>
+              <a:ea typeface="+mn-ea"/>
+              <a:cs typeface="+mn-cs"/>
+            </a:defRPr>
+          </a:pPr>
+          <a:endParaRPr lang="en-US"/>
+        </a:p>
+      </c:txPr>
+    </c:title>
+    <c:autoTitleDeleted val="0"/>
+    <c:plotArea>
+      <c:layout/>
+      <c:stockChart>
+        <c:ser>
+          <c:idx val="0"/>
+          <c:order val="0"/>
+          <c:tx>
+            <c:strRef>
+              <c:f>Sheet1!$O$1</c:f>
+              <c:strCache>
+                <c:ptCount val="1"/>
+                <c:pt idx="0">
+                  <c:v>Open</c:v>
+                </c:pt>
+              </c:strCache>
+            </c:strRef>
+          </c:tx>
+          <c:spPr>
+            <a:ln w="25400" cap="rnd">
+              <a:noFill/>
+              <a:round/>
+            </a:ln>
+            <a:effectLst/>
+          </c:spPr>
+          <c:marker>
+            <c:symbol val="none"/>
+          </c:marker>
+          <c:cat>
+            <c:strRef>
+              <c:f>Sheet1!$N$2:$N$5</c:f>
+              <c:strCache>
+                <c:ptCount val="4"/>
+                <c:pt idx="0">
+                  <c:v>Mon</c:v>
+                </c:pt>
+                <c:pt idx="1">
+                  <c:v>Tue</c:v>
+                </c:pt>
+                <c:pt idx="2">
+                  <c:v>Wed</c:v>
+                </c:pt>
+                <c:pt idx="3">
+                  <c:v>Thu</c:v>
+                </c:pt>
+              </c:strCache>
+            </c:strRef>
+          </c:cat>
+          <c:val>
+            <c:numRef>
+              <c:f>Sheet1!$O$2:$O$5</c:f>
+              <c:numCache>
+                <c:formatCode>General</c:formatCode>
+                <c:ptCount val="4"/>
+                <c:pt idx="0">
+                  <c:v>10</c:v>
+                </c:pt>
+                <c:pt idx="1">
+                  <c:v>11</c:v>
+                </c:pt>
+                <c:pt idx="2">
+                  <c:v>12</c:v>
+                </c:pt>
+                <c:pt idx="3">
+                  <c:v>11</c:v>
+                </c:pt>
+              </c:numCache>
+            </c:numRef>
+          </c:val>
+          <c:smooth val="0"/>
+          <c:extLst>
+            <c:ext xmlns:c16="http://schemas.microsoft.com/office/drawing/2014/chart" uri="{C3380CC4-5D6E-409C-BE32-E72D297353CC}">
+              <c16:uniqueId val="{00000000-8EB4-4420-8677-DBD873F8CDED}"/>
+            </c:ext>
+          </c:extLst>
+        </c:ser>
+        <c:ser>
+          <c:idx val="1"/>
+          <c:order val="1"/>
+          <c:tx>
+            <c:strRef>
+              <c:f>Sheet1!$P$1</c:f>
+              <c:strCache>
+                <c:ptCount val="1"/>
+                <c:pt idx="0">
+                  <c:v>High</c:v>
+                </c:pt>
+              </c:strCache>
+            </c:strRef>
+          </c:tx>
+          <c:spPr>
+            <a:ln w="25400" cap="rnd">
+              <a:noFill/>
+              <a:round/>
+            </a:ln>
+            <a:effectLst/>
+          </c:spPr>
+          <c:marker>
+            <c:symbol val="none"/>
+          </c:marker>
+          <c:cat>
+            <c:strRef>
+              <c:f>Sheet1!$N$2:$N$5</c:f>
+              <c:strCache>
+                <c:ptCount val="4"/>
+                <c:pt idx="0">
+                  <c:v>Mon</c:v>
+                </c:pt>
+                <c:pt idx="1">
+                  <c:v>Tue</c:v>
+                </c:pt>
+                <c:pt idx="2">
+                  <c:v>Wed</c:v>
+                </c:pt>
+                <c:pt idx="3">
+                  <c:v>Thu</c:v>
+                </c:pt>
+              </c:strCache>
+            </c:strRef>
+          </c:cat>
+          <c:val>
+            <c:numRef>
+              <c:f>Sheet1!$P$2:$P$5</c:f>
+              <c:numCache>
+                <c:formatCode>General</c:formatCode>
+                <c:ptCount val="4"/>
+                <c:pt idx="0">
+                  <c:v>14</c:v>
+                </c:pt>
+                <c:pt idx="1">
+                  <c:v>15</c:v>
+                </c:pt>
+                <c:pt idx="2">
+                  <c:v>15</c:v>
+                </c:pt>
+                <c:pt idx="3">
+                  <c:v>14</c:v>
+                </c:pt>
+              </c:numCache>
+            </c:numRef>
+          </c:val>
+          <c:smooth val="0"/>
+          <c:extLst>
+            <c:ext xmlns:c16="http://schemas.microsoft.com/office/drawing/2014/chart" uri="{C3380CC4-5D6E-409C-BE32-E72D297353CC}">
+              <c16:uniqueId val="{00000001-8EB4-4420-8677-DBD873F8CDED}"/>
+            </c:ext>
+          </c:extLst>
+        </c:ser>
+        <c:ser>
+          <c:idx val="2"/>
+          <c:order val="2"/>
+          <c:tx>
+            <c:strRef>
+              <c:f>Sheet1!$Q$1</c:f>
+              <c:strCache>
+                <c:ptCount val="1"/>
+                <c:pt idx="0">
+                  <c:v>Low</c:v>
+                </c:pt>
+              </c:strCache>
+            </c:strRef>
+          </c:tx>
+          <c:spPr>
+            <a:ln w="25400" cap="rnd">
+              <a:noFill/>
+              <a:round/>
+            </a:ln>
+            <a:effectLst/>
+          </c:spPr>
+          <c:marker>
+            <c:symbol val="none"/>
+          </c:marker>
+          <c:cat>
+            <c:strRef>
+              <c:f>Sheet1!$N$2:$N$5</c:f>
+              <c:strCache>
+                <c:ptCount val="4"/>
+                <c:pt idx="0">
+                  <c:v>Mon</c:v>
+                </c:pt>
+                <c:pt idx="1">
+                  <c:v>Tue</c:v>
+                </c:pt>
+                <c:pt idx="2">
+                  <c:v>Wed</c:v>
+                </c:pt>
+                <c:pt idx="3">
+                  <c:v>Thu</c:v>
+                </c:pt>
+              </c:strCache>
+            </c:strRef>
+          </c:cat>
+          <c:val>
+            <c:numRef>
+              <c:f>Sheet1!$Q$2:$Q$5</c:f>
+              <c:numCache>
+                <c:formatCode>General</c:formatCode>
+                <c:ptCount val="4"/>
+                <c:pt idx="0">
+                  <c:v>9</c:v>
+                </c:pt>
+                <c:pt idx="1">
+                  <c:v>10</c:v>
+                </c:pt>
+                <c:pt idx="2">
+                  <c:v>10</c:v>
+                </c:pt>
+                <c:pt idx="3">
+                  <c:v>9</c:v>
+                </c:pt>
+              </c:numCache>
+            </c:numRef>
+          </c:val>
+          <c:smooth val="0"/>
+          <c:extLst>
+            <c:ext xmlns:c16="http://schemas.microsoft.com/office/drawing/2014/chart" uri="{C3380CC4-5D6E-409C-BE32-E72D297353CC}">
+              <c16:uniqueId val="{00000002-8EB4-4420-8677-DBD873F8CDED}"/>
+            </c:ext>
+          </c:extLst>
+        </c:ser>
+        <c:ser>
+          <c:idx val="3"/>
+          <c:order val="3"/>
+          <c:tx>
+            <c:strRef>
+              <c:f>Sheet1!$R$1</c:f>
+              <c:strCache>
+                <c:ptCount val="1"/>
+                <c:pt idx="0">
+                  <c:v>Close</c:v>
+                </c:pt>
+              </c:strCache>
+            </c:strRef>
+          </c:tx>
+          <c:spPr>
+            <a:ln w="25400" cap="rnd">
+              <a:noFill/>
+              <a:round/>
+            </a:ln>
+            <a:effectLst/>
+          </c:spPr>
+          <c:marker>
+            <c:symbol val="none"/>
+          </c:marker>
+          <c:cat>
+            <c:strRef>
+              <c:f>Sheet1!$N$2:$N$5</c:f>
+              <c:strCache>
+                <c:ptCount val="4"/>
+                <c:pt idx="0">
+                  <c:v>Mon</c:v>
+                </c:pt>
+                <c:pt idx="1">
+                  <c:v>Tue</c:v>
+                </c:pt>
+                <c:pt idx="2">
+                  <c:v>Wed</c:v>
+                </c:pt>
+                <c:pt idx="3">
+                  <c:v>Thu</c:v>
+                </c:pt>
+              </c:strCache>
+            </c:strRef>
+          </c:cat>
+          <c:val>
+            <c:numRef>
+              <c:f>Sheet1!$R$2:$R$5</c:f>
+              <c:numCache>
+                <c:formatCode>General</c:formatCode>
+                <c:ptCount val="4"/>
+                <c:pt idx="0">
+                  <c:v>12</c:v>
+                </c:pt>
+                <c:pt idx="1">
+                  <c:v>13</c:v>
+                </c:pt>
+                <c:pt idx="2">
+                  <c:v>11</c:v>
+                </c:pt>
+                <c:pt idx="3">
+                  <c:v>13</c:v>
+                </c:pt>
+              </c:numCache>
+            </c:numRef>
+          </c:val>
+          <c:smooth val="0"/>
+          <c:extLst>
+            <c:ext xmlns:c16="http://schemas.microsoft.com/office/drawing/2014/chart" uri="{C3380CC4-5D6E-409C-BE32-E72D297353CC}">
+              <c16:uniqueId val="{00000003-8EB4-4420-8677-DBD873F8CDED}"/>
+            </c:ext>
+          </c:extLst>
+        </c:ser>
+        <c:dLbls>
+          <c:showLegendKey val="0"/>
+          <c:showVal val="0"/>
+          <c:showCatName val="0"/>
+          <c:showSerName val="0"/>
+          <c:showPercent val="0"/>
+          <c:showBubbleSize val="0"/>
+        </c:dLbls>
+        <c:hiLowLines>
+          <c:spPr>
+            <a:ln w="9525" cap="flat" cmpd="sng" algn="ctr">
+              <a:solidFill>
+                <a:schemeClr val="tx1">
+                  <a:lumMod val="75000"/>
+                  <a:lumOff val="25000"/>
+                </a:schemeClr>
+              </a:solidFill>
+              <a:round/>
+            </a:ln>
+            <a:effectLst/>
+          </c:spPr>
+        </c:hiLowLines>
+        <c:upDownBars>
+          <c:gapWidth val="219"/>
+          <c:upBars>
+            <c:spPr>
+              <a:solidFill>
+                <a:schemeClr val="lt1"/>
+              </a:solidFill>
+              <a:ln w="9525">
+                <a:solidFill>
+                  <a:schemeClr val="tx1">
+                    <a:lumMod val="15000"/>
+                    <a:lumOff val="85000"/>
+                  </a:schemeClr>
+                </a:solidFill>
+              </a:ln>
+              <a:effectLst/>
+            </c:spPr>
+          </c:upBars>
+          <c:downBars>
+            <c:spPr>
+              <a:solidFill>
+                <a:schemeClr val="dk1">
+                  <a:lumMod val="65000"/>
+                  <a:lumOff val="35000"/>
+                </a:schemeClr>
+              </a:solidFill>
+              <a:ln w="9525">
+                <a:solidFill>
+                  <a:schemeClr val="tx1">
+                    <a:lumMod val="65000"/>
+                    <a:lumOff val="35000"/>
+                  </a:schemeClr>
+                </a:solidFill>
+              </a:ln>
+              <a:effectLst/>
+            </c:spPr>
+          </c:downBars>
+        </c:upDownBars>
+        <c:axId val="894339039"/>
+        <c:axId val="1704379792"/>
+      </c:stockChart>
+      <c:catAx>
+        <c:axId val="894339039"/>
+        <c:scaling>
+          <c:orientation val="minMax"/>
+        </c:scaling>
+        <c:delete val="0"/>
+        <c:axPos val="b"/>
+        <c:numFmt formatCode="General" sourceLinked="1"/>
+        <c:majorTickMark val="none"/>
+        <c:minorTickMark val="none"/>
+        <c:tickLblPos val="nextTo"/>
+        <c:spPr>
+          <a:noFill/>
+          <a:ln w="9525" cap="flat" cmpd="sng" algn="ctr">
+            <a:solidFill>
+              <a:schemeClr val="tx1">
+                <a:lumMod val="15000"/>
+                <a:lumOff val="85000"/>
+              </a:schemeClr>
+            </a:solidFill>
+            <a:round/>
+          </a:ln>
+          <a:effectLst/>
+        </c:spPr>
+        <c:txPr>
+          <a:bodyPr rot="-60000000" spcFirstLastPara="1" vertOverflow="ellipsis" vert="horz" wrap="square" anchor="ctr" anchorCtr="1"/>
+          <a:lstStyle/>
+          <a:p>
+            <a:pPr>
+              <a:defRPr sz="900" b="0" i="0" u="none" strike="noStrike" kern="1200" baseline="0">
+                <a:solidFill>
+                  <a:schemeClr val="tx1">
+                    <a:lumMod val="65000"/>
+                    <a:lumOff val="35000"/>
+                  </a:schemeClr>
+                </a:solidFill>
+                <a:latin typeface="+mn-lt"/>
+                <a:ea typeface="+mn-ea"/>
+                <a:cs typeface="+mn-cs"/>
+              </a:defRPr>
+            </a:pPr>
+            <a:endParaRPr lang="en-US"/>
+          </a:p>
+        </c:txPr>
+        <c:crossAx val="1704379792"/>
+        <c:crosses val="autoZero"/>
+        <c:auto val="1"/>
+        <c:lblAlgn val="ctr"/>
+        <c:lblOffset val="100"/>
+        <c:noMultiLvlLbl val="0"/>
+      </c:catAx>
+      <c:valAx>
+        <c:axId val="1704379792"/>
+        <c:scaling>
+          <c:orientation val="minMax"/>
+        </c:scaling>
+        <c:delete val="0"/>
+        <c:axPos val="l"/>
+        <c:majorGridlines>
+          <c:spPr>
+            <a:ln w="9525" cap="flat" cmpd="sng" algn="ctr">
+              <a:solidFill>
+                <a:schemeClr val="tx1">
+                  <a:lumMod val="15000"/>
+                  <a:lumOff val="85000"/>
+                </a:schemeClr>
+              </a:solidFill>
+              <a:round/>
+            </a:ln>
+            <a:effectLst/>
+          </c:spPr>
+        </c:majorGridlines>
+        <c:numFmt formatCode="General" sourceLinked="1"/>
+        <c:majorTickMark val="none"/>
+        <c:minorTickMark val="none"/>
+        <c:tickLblPos val="nextTo"/>
+        <c:spPr>
+          <a:noFill/>
+          <a:ln>
+            <a:noFill/>
+          </a:ln>
+          <a:effectLst/>
+        </c:spPr>
+        <c:txPr>
+          <a:bodyPr rot="-60000000" spcFirstLastPara="1" vertOverflow="ellipsis" vert="horz" wrap="square" anchor="ctr" anchorCtr="1"/>
+          <a:lstStyle/>
+          <a:p>
+            <a:pPr>
+              <a:defRPr sz="900" b="0" i="0" u="none" strike="noStrike" kern="1200" baseline="0">
+                <a:solidFill>
+                  <a:schemeClr val="tx1">
+                    <a:lumMod val="65000"/>
+                    <a:lumOff val="35000"/>
+                  </a:schemeClr>
+                </a:solidFill>
+                <a:latin typeface="+mn-lt"/>
+                <a:ea typeface="+mn-ea"/>
+                <a:cs typeface="+mn-cs"/>
+              </a:defRPr>
+            </a:pPr>
+            <a:endParaRPr lang="en-US"/>
+          </a:p>
+        </c:txPr>
+        <c:crossAx val="894339039"/>
+        <c:crosses val="autoZero"/>
+        <c:crossBetween val="between"/>
+      </c:valAx>
       <c:spPr>
         <a:noFill/>
         <a:ln>
@@ -1686,7 +2885,7 @@
     </cx:title>
     <cx:plotArea>
       <cx:plotAreaRegion>
-        <cx:series layoutId="waterfall" uniqueId="{00000002-F82F-4E6A-AEB3-6A092F3544C8}">
+        <cx:series layoutId="waterfall" uniqueId="{00000002-5DE3-4CA0-BD7D-F9B56550DF4D}">
           <cx:tx>
             <cx:txData>
               <cx:f>Sheet1!$F$1</cx:f>
@@ -1724,7 +2923,7 @@
     <cx:externalData r:id="rId1" cx:autoUpdate="0"/>
     <cx:data id="0">
       <cx:numDim type="val">
-        <cx:f>[Book1]Sheet1!$H$2:$H$21</cx:f>
+        <cx:f>Sheet1!$H$2:$H$21</cx:f>
         <cx:lvl ptCount="20" formatCode="General">
           <cx:pt idx="0">3</cx:pt>
           <cx:pt idx="1">5</cx:pt>
@@ -1760,10 +2959,10 @@
     </cx:title>
     <cx:plotArea>
       <cx:plotAreaRegion>
-        <cx:series layoutId="clusteredColumn" uniqueId="{00000002-6B2A-4847-8B4F-6333C03568D9}">
+        <cx:series layoutId="clusteredColumn" uniqueId="{00000002-ACC9-47B1-89AC-7A7DD8CC72E3}">
           <cx:tx>
             <cx:txData>
-              <cx:f>[Book1]Sheet1!$H$1</cx:f>
+              <cx:f>Sheet1!$H$1</cx:f>
               <cx:v>Score</cx:v>
             </cx:txData>
           </cx:tx>
@@ -1782,6 +2981,126 @@
         <cx:majorGridlines/>
         <cx:tickLabels/>
       </cx:axis>
+    </cx:plotArea>
+  </cx:chart>
+</cx:chartSpace>
+</file>
+
+<file path=word/charts/chartEx3.xml><?xml version="1.0" encoding="utf-8"?>
+<cx:chartSpace xmlns:a="http://schemas.openxmlformats.org/drawingml/2006/main" xmlns:r="http://schemas.openxmlformats.org/officeDocument/2006/relationships" xmlns:cx="http://schemas.microsoft.com/office/drawing/2014/chartex">
+  <cx:chartData>
+    <cx:externalData r:id="rId1" cx:autoUpdate="0"/>
+    <cx:data id="0">
+      <cx:strDim type="cat">
+        <cx:f>Sheet1!$T$2:$U$6</cx:f>
+        <cx:lvl ptCount="5">
+          <cx:pt idx="0">Apple</cx:pt>
+          <cx:pt idx="1">Pear</cx:pt>
+          <cx:pt idx="2">Leek</cx:pt>
+          <cx:pt idx="3">Kale</cx:pt>
+          <cx:pt idx="4">Almond</cx:pt>
+        </cx:lvl>
+        <cx:lvl ptCount="5">
+          <cx:pt idx="0">Fruit</cx:pt>
+          <cx:pt idx="1">Fruit</cx:pt>
+          <cx:pt idx="2">Veg</cx:pt>
+          <cx:pt idx="3">Veg</cx:pt>
+          <cx:pt idx="4">Nuts</cx:pt>
+        </cx:lvl>
+      </cx:strDim>
+      <cx:numDim type="size">
+        <cx:f>Sheet1!$V$2:$V$6</cx:f>
+        <cx:lvl ptCount="5" formatCode="General">
+          <cx:pt idx="0">30</cx:pt>
+          <cx:pt idx="1">20</cx:pt>
+          <cx:pt idx="2">10</cx:pt>
+          <cx:pt idx="3">5</cx:pt>
+          <cx:pt idx="4">8</cx:pt>
+        </cx:lvl>
+      </cx:numDim>
+    </cx:data>
+  </cx:chartData>
+  <cx:chart>
+    <cx:title pos="t" align="ctr" overlay="0">
+      <cx:tx>
+        <cx:txData>
+          <cx:v>Produce treemap</cx:v>
+        </cx:txData>
+      </cx:tx>
+    </cx:title>
+    <cx:plotArea>
+      <cx:plotAreaRegion>
+        <cx:series layoutId="treemap" uniqueId="{00000002-1593-418E-9A64-4824710C22B3}">
+          <cx:tx>
+            <cx:txData>
+              <cx:f>Sheet1!$V$1</cx:f>
+              <cx:v>Weight</cx:v>
+            </cx:txData>
+          </cx:tx>
+          <cx:dataId val="0"/>
+          <cx:layoutPr/>
+        </cx:series>
+      </cx:plotAreaRegion>
+    </cx:plotArea>
+    <cx:legend pos="t" align="ctr" overlay="0"/>
+  </cx:chart>
+</cx:chartSpace>
+</file>
+
+<file path=word/charts/chartEx4.xml><?xml version="1.0" encoding="utf-8"?>
+<cx:chartSpace xmlns:a="http://schemas.openxmlformats.org/drawingml/2006/main" xmlns:r="http://schemas.openxmlformats.org/officeDocument/2006/relationships" xmlns:cx="http://schemas.microsoft.com/office/drawing/2014/chartex">
+  <cx:chartData>
+    <cx:externalData r:id="rId1" cx:autoUpdate="0"/>
+    <cx:data id="0">
+      <cx:strDim type="cat">
+        <cx:f>[Book1]Sheet1!$T$2:$U$6</cx:f>
+        <cx:lvl ptCount="5">
+          <cx:pt idx="0">Apple</cx:pt>
+          <cx:pt idx="1">Pear</cx:pt>
+          <cx:pt idx="2">Leek</cx:pt>
+          <cx:pt idx="3">Kale</cx:pt>
+          <cx:pt idx="4">Almond</cx:pt>
+        </cx:lvl>
+        <cx:lvl ptCount="5">
+          <cx:pt idx="0">Fruit</cx:pt>
+          <cx:pt idx="1">Fruit</cx:pt>
+          <cx:pt idx="2">Veg</cx:pt>
+          <cx:pt idx="3">Veg</cx:pt>
+          <cx:pt idx="4">Nuts</cx:pt>
+        </cx:lvl>
+      </cx:strDim>
+      <cx:numDim type="size">
+        <cx:f>[Book1]Sheet1!$V$2:$V$6</cx:f>
+        <cx:lvl ptCount="5" formatCode="General">
+          <cx:pt idx="0">30</cx:pt>
+          <cx:pt idx="1">20</cx:pt>
+          <cx:pt idx="2">10</cx:pt>
+          <cx:pt idx="3">5</cx:pt>
+          <cx:pt idx="4">8</cx:pt>
+        </cx:lvl>
+      </cx:numDim>
+    </cx:data>
+  </cx:chartData>
+  <cx:chart>
+    <cx:title pos="t" align="ctr" overlay="0">
+      <cx:tx>
+        <cx:txData>
+          <cx:v>Produce sunburst</cx:v>
+        </cx:txData>
+      </cx:tx>
+    </cx:title>
+    <cx:plotArea>
+      <cx:plotAreaRegion>
+        <cx:series layoutId="sunburst" uniqueId="{00000002-219C-4CDA-882B-DE56BF45363A}">
+          <cx:tx>
+            <cx:txData>
+              <cx:f>[Book1]Sheet1!$V$1</cx:f>
+              <cx:v>Weight</cx:v>
+            </cx:txData>
+          </cx:tx>
+          <cx:dataId val="0"/>
+        </cx:series>
+      </cx:plotAreaRegion>
     </cx:plotArea>
   </cx:chart>
 </cx:chartSpace>
@@ -1907,6 +3226,166 @@
 </cs:colorStyle>
 </file>
 
+<file path=word/charts/colors4.xml><?xml version="1.0" encoding="utf-8"?>
+<cs:colorStyle xmlns:cs="http://schemas.microsoft.com/office/drawing/2012/chartStyle" xmlns:a="http://schemas.openxmlformats.org/drawingml/2006/main" meth="cycle" id="10">
+  <a:schemeClr val="accent1"/>
+  <a:schemeClr val="accent2"/>
+  <a:schemeClr val="accent3"/>
+  <a:schemeClr val="accent4"/>
+  <a:schemeClr val="accent5"/>
+  <a:schemeClr val="accent6"/>
+  <cs:variation/>
+  <cs:variation>
+    <a:lumMod val="60000"/>
+  </cs:variation>
+  <cs:variation>
+    <a:lumMod val="80000"/>
+    <a:lumOff val="20000"/>
+  </cs:variation>
+  <cs:variation>
+    <a:lumMod val="80000"/>
+  </cs:variation>
+  <cs:variation>
+    <a:lumMod val="60000"/>
+    <a:lumOff val="40000"/>
+  </cs:variation>
+  <cs:variation>
+    <a:lumMod val="50000"/>
+  </cs:variation>
+  <cs:variation>
+    <a:lumMod val="70000"/>
+    <a:lumOff val="30000"/>
+  </cs:variation>
+  <cs:variation>
+    <a:lumMod val="70000"/>
+  </cs:variation>
+  <cs:variation>
+    <a:lumMod val="50000"/>
+    <a:lumOff val="50000"/>
+  </cs:variation>
+</cs:colorStyle>
+</file>
+
+<file path=word/charts/colors5.xml><?xml version="1.0" encoding="utf-8"?>
+<cs:colorStyle xmlns:cs="http://schemas.microsoft.com/office/drawing/2012/chartStyle" xmlns:a="http://schemas.openxmlformats.org/drawingml/2006/main" meth="cycle" id="10">
+  <a:schemeClr val="accent1"/>
+  <a:schemeClr val="accent2"/>
+  <a:schemeClr val="accent3"/>
+  <a:schemeClr val="accent4"/>
+  <a:schemeClr val="accent5"/>
+  <a:schemeClr val="accent6"/>
+  <cs:variation/>
+  <cs:variation>
+    <a:lumMod val="60000"/>
+  </cs:variation>
+  <cs:variation>
+    <a:lumMod val="80000"/>
+    <a:lumOff val="20000"/>
+  </cs:variation>
+  <cs:variation>
+    <a:lumMod val="80000"/>
+  </cs:variation>
+  <cs:variation>
+    <a:lumMod val="60000"/>
+    <a:lumOff val="40000"/>
+  </cs:variation>
+  <cs:variation>
+    <a:lumMod val="50000"/>
+  </cs:variation>
+  <cs:variation>
+    <a:lumMod val="70000"/>
+    <a:lumOff val="30000"/>
+  </cs:variation>
+  <cs:variation>
+    <a:lumMod val="70000"/>
+  </cs:variation>
+  <cs:variation>
+    <a:lumMod val="50000"/>
+    <a:lumOff val="50000"/>
+  </cs:variation>
+</cs:colorStyle>
+</file>
+
+<file path=word/charts/colors6.xml><?xml version="1.0" encoding="utf-8"?>
+<cs:colorStyle xmlns:cs="http://schemas.microsoft.com/office/drawing/2012/chartStyle" xmlns:a="http://schemas.openxmlformats.org/drawingml/2006/main" meth="cycle" id="10">
+  <a:schemeClr val="accent1"/>
+  <a:schemeClr val="accent2"/>
+  <a:schemeClr val="accent3"/>
+  <a:schemeClr val="accent4"/>
+  <a:schemeClr val="accent5"/>
+  <a:schemeClr val="accent6"/>
+  <cs:variation/>
+  <cs:variation>
+    <a:lumMod val="60000"/>
+  </cs:variation>
+  <cs:variation>
+    <a:lumMod val="80000"/>
+    <a:lumOff val="20000"/>
+  </cs:variation>
+  <cs:variation>
+    <a:lumMod val="80000"/>
+  </cs:variation>
+  <cs:variation>
+    <a:lumMod val="60000"/>
+    <a:lumOff val="40000"/>
+  </cs:variation>
+  <cs:variation>
+    <a:lumMod val="50000"/>
+  </cs:variation>
+  <cs:variation>
+    <a:lumMod val="70000"/>
+    <a:lumOff val="30000"/>
+  </cs:variation>
+  <cs:variation>
+    <a:lumMod val="70000"/>
+  </cs:variation>
+  <cs:variation>
+    <a:lumMod val="50000"/>
+    <a:lumOff val="50000"/>
+  </cs:variation>
+</cs:colorStyle>
+</file>
+
+<file path=word/charts/colors7.xml><?xml version="1.0" encoding="utf-8"?>
+<cs:colorStyle xmlns:cs="http://schemas.microsoft.com/office/drawing/2012/chartStyle" xmlns:a="http://schemas.openxmlformats.org/drawingml/2006/main" meth="cycle" id="10">
+  <a:schemeClr val="accent1"/>
+  <a:schemeClr val="accent2"/>
+  <a:schemeClr val="accent3"/>
+  <a:schemeClr val="accent4"/>
+  <a:schemeClr val="accent5"/>
+  <a:schemeClr val="accent6"/>
+  <cs:variation/>
+  <cs:variation>
+    <a:lumMod val="60000"/>
+  </cs:variation>
+  <cs:variation>
+    <a:lumMod val="80000"/>
+    <a:lumOff val="20000"/>
+  </cs:variation>
+  <cs:variation>
+    <a:lumMod val="80000"/>
+  </cs:variation>
+  <cs:variation>
+    <a:lumMod val="60000"/>
+    <a:lumOff val="40000"/>
+  </cs:variation>
+  <cs:variation>
+    <a:lumMod val="50000"/>
+  </cs:variation>
+  <cs:variation>
+    <a:lumMod val="70000"/>
+    <a:lumOff val="30000"/>
+  </cs:variation>
+  <cs:variation>
+    <a:lumMod val="70000"/>
+  </cs:variation>
+  <cs:variation>
+    <a:lumMod val="50000"/>
+    <a:lumOff val="50000"/>
+  </cs:variation>
+</cs:colorStyle>
+</file>
+
 <file path=word/charts/style1.xml><?xml version="1.0" encoding="utf-8"?>
 <cs:chartStyle xmlns:cs="http://schemas.microsoft.com/office/drawing/2012/chartStyle" xmlns:a="http://schemas.openxmlformats.org/drawingml/2006/main" id="201">
   <cs:axisTitle>
@@ -3031,6 +4510,2076 @@
       <a:solidFill>
         <a:schemeClr val="phClr"/>
       </a:solidFill>
+    </cs:spPr>
+  </cs:dataPoint>
+  <cs:dataPoint3D>
+    <cs:lnRef idx="0"/>
+    <cs:fillRef idx="0">
+      <cs:styleClr val="auto"/>
+    </cs:fillRef>
+    <cs:effectRef idx="0"/>
+    <cs:fontRef idx="minor">
+      <a:schemeClr val="tx1"/>
+    </cs:fontRef>
+    <cs:spPr>
+      <a:solidFill>
+        <a:schemeClr val="phClr"/>
+      </a:solidFill>
+    </cs:spPr>
+  </cs:dataPoint3D>
+  <cs:dataPointLine>
+    <cs:lnRef idx="0">
+      <cs:styleClr val="auto"/>
+    </cs:lnRef>
+    <cs:fillRef idx="0"/>
+    <cs:effectRef idx="0"/>
+    <cs:fontRef idx="minor">
+      <a:schemeClr val="tx1"/>
+    </cs:fontRef>
+    <cs:spPr>
+      <a:ln w="28575" cap="rnd">
+        <a:solidFill>
+          <a:schemeClr val="phClr"/>
+        </a:solidFill>
+        <a:round/>
+      </a:ln>
+    </cs:spPr>
+  </cs:dataPointLine>
+  <cs:dataPointMarker>
+    <cs:lnRef idx="0"/>
+    <cs:fillRef idx="0">
+      <cs:styleClr val="auto"/>
+    </cs:fillRef>
+    <cs:effectRef idx="0"/>
+    <cs:fontRef idx="minor">
+      <a:schemeClr val="tx1"/>
+    </cs:fontRef>
+    <cs:spPr>
+      <a:solidFill>
+        <a:schemeClr val="phClr"/>
+      </a:solidFill>
+      <a:ln w="9525">
+        <a:solidFill>
+          <a:schemeClr val="lt1"/>
+        </a:solidFill>
+      </a:ln>
+    </cs:spPr>
+  </cs:dataPointMarker>
+  <cs:dataPointMarkerLayout symbol="circle" size="5"/>
+  <cs:dataPointWireframe>
+    <cs:lnRef idx="0">
+      <cs:styleClr val="auto"/>
+    </cs:lnRef>
+    <cs:fillRef idx="0"/>
+    <cs:effectRef idx="0"/>
+    <cs:fontRef idx="minor">
+      <a:schemeClr val="tx1"/>
+    </cs:fontRef>
+    <cs:spPr>
+      <a:ln w="28575" cap="rnd">
+        <a:solidFill>
+          <a:schemeClr val="phClr"/>
+        </a:solidFill>
+        <a:round/>
+      </a:ln>
+    </cs:spPr>
+  </cs:dataPointWireframe>
+  <cs:dataTable>
+    <cs:lnRef idx="0"/>
+    <cs:fillRef idx="0"/>
+    <cs:effectRef idx="0"/>
+    <cs:fontRef idx="minor">
+      <a:schemeClr val="tx1">
+        <a:lumMod val="65000"/>
+        <a:lumOff val="35000"/>
+      </a:schemeClr>
+    </cs:fontRef>
+    <cs:spPr>
+      <a:ln w="9525">
+        <a:solidFill>
+          <a:schemeClr val="tx1">
+            <a:lumMod val="15000"/>
+            <a:lumOff val="85000"/>
+          </a:schemeClr>
+        </a:solidFill>
+      </a:ln>
+    </cs:spPr>
+    <cs:defRPr sz="900"/>
+  </cs:dataTable>
+  <cs:downBar>
+    <cs:lnRef idx="0"/>
+    <cs:fillRef idx="0"/>
+    <cs:effectRef idx="0"/>
+    <cs:fontRef idx="minor">
+      <a:schemeClr val="dk1"/>
+    </cs:fontRef>
+    <cs:spPr>
+      <a:solidFill>
+        <a:schemeClr val="dk1">
+          <a:lumMod val="65000"/>
+          <a:lumOff val="35000"/>
+        </a:schemeClr>
+      </a:solidFill>
+      <a:ln w="9525">
+        <a:solidFill>
+          <a:schemeClr val="tx1">
+            <a:lumMod val="65000"/>
+            <a:lumOff val="35000"/>
+          </a:schemeClr>
+        </a:solidFill>
+      </a:ln>
+    </cs:spPr>
+  </cs:downBar>
+  <cs:dropLine>
+    <cs:lnRef idx="0"/>
+    <cs:fillRef idx="0"/>
+    <cs:effectRef idx="0"/>
+    <cs:fontRef idx="minor">
+      <a:schemeClr val="tx1"/>
+    </cs:fontRef>
+    <cs:spPr>
+      <a:ln w="9525" cap="flat" cmpd="sng" algn="ctr">
+        <a:solidFill>
+          <a:schemeClr val="tx1">
+            <a:lumMod val="35000"/>
+            <a:lumOff val="65000"/>
+          </a:schemeClr>
+        </a:solidFill>
+        <a:round/>
+      </a:ln>
+    </cs:spPr>
+  </cs:dropLine>
+  <cs:errorBar>
+    <cs:lnRef idx="0"/>
+    <cs:fillRef idx="0"/>
+    <cs:effectRef idx="0"/>
+    <cs:fontRef idx="minor">
+      <a:schemeClr val="tx1"/>
+    </cs:fontRef>
+    <cs:spPr>
+      <a:ln w="9525" cap="flat" cmpd="sng" algn="ctr">
+        <a:solidFill>
+          <a:schemeClr val="tx1">
+            <a:lumMod val="65000"/>
+            <a:lumOff val="35000"/>
+          </a:schemeClr>
+        </a:solidFill>
+        <a:round/>
+      </a:ln>
+    </cs:spPr>
+  </cs:errorBar>
+  <cs:floor>
+    <cs:lnRef idx="0"/>
+    <cs:fillRef idx="0"/>
+    <cs:effectRef idx="0"/>
+    <cs:fontRef idx="minor">
+      <a:schemeClr val="tx1"/>
+    </cs:fontRef>
+  </cs:floor>
+  <cs:gridlineMajor>
+    <cs:lnRef idx="0"/>
+    <cs:fillRef idx="0"/>
+    <cs:effectRef idx="0"/>
+    <cs:fontRef idx="minor">
+      <a:schemeClr val="tx1"/>
+    </cs:fontRef>
+    <cs:spPr>
+      <a:ln w="9525" cap="flat" cmpd="sng" algn="ctr">
+        <a:solidFill>
+          <a:schemeClr val="tx1">
+            <a:lumMod val="15000"/>
+            <a:lumOff val="85000"/>
+          </a:schemeClr>
+        </a:solidFill>
+        <a:round/>
+      </a:ln>
+    </cs:spPr>
+  </cs:gridlineMajor>
+  <cs:gridlineMinor>
+    <cs:lnRef idx="0"/>
+    <cs:fillRef idx="0"/>
+    <cs:effectRef idx="0"/>
+    <cs:fontRef idx="minor">
+      <a:schemeClr val="tx1"/>
+    </cs:fontRef>
+    <cs:spPr>
+      <a:ln w="9525" cap="flat" cmpd="sng" algn="ctr">
+        <a:solidFill>
+          <a:schemeClr val="tx1">
+            <a:lumMod val="15000"/>
+            <a:lumOff val="85000"/>
+          </a:schemeClr>
+        </a:solidFill>
+        <a:round/>
+      </a:ln>
+    </cs:spPr>
+  </cs:gridlineMinor>
+  <cs:hiLoLine>
+    <cs:lnRef idx="0"/>
+    <cs:fillRef idx="0"/>
+    <cs:effectRef idx="0"/>
+    <cs:fontRef idx="minor">
+      <a:schemeClr val="tx1"/>
+    </cs:fontRef>
+    <cs:spPr>
+      <a:ln w="9525" cap="flat" cmpd="sng" algn="ctr">
+        <a:solidFill>
+          <a:schemeClr val="tx1">
+            <a:lumMod val="75000"/>
+            <a:lumOff val="25000"/>
+          </a:schemeClr>
+        </a:solidFill>
+        <a:round/>
+      </a:ln>
+    </cs:spPr>
+  </cs:hiLoLine>
+  <cs:leaderLine>
+    <cs:lnRef idx="0"/>
+    <cs:fillRef idx="0"/>
+    <cs:effectRef idx="0"/>
+    <cs:fontRef idx="minor">
+      <a:schemeClr val="tx1"/>
+    </cs:fontRef>
+    <cs:spPr>
+      <a:ln w="9525" cap="flat" cmpd="sng" algn="ctr">
+        <a:solidFill>
+          <a:schemeClr val="tx1">
+            <a:lumMod val="35000"/>
+            <a:lumOff val="65000"/>
+          </a:schemeClr>
+        </a:solidFill>
+        <a:round/>
+      </a:ln>
+    </cs:spPr>
+  </cs:leaderLine>
+  <cs:legend>
+    <cs:lnRef idx="0"/>
+    <cs:fillRef idx="0"/>
+    <cs:effectRef idx="0"/>
+    <cs:fontRef idx="minor">
+      <a:schemeClr val="tx1">
+        <a:lumMod val="65000"/>
+        <a:lumOff val="35000"/>
+      </a:schemeClr>
+    </cs:fontRef>
+    <cs:defRPr sz="900"/>
+  </cs:legend>
+  <cs:plotArea mods="allowNoFillOverride allowNoLineOverride">
+    <cs:lnRef idx="0"/>
+    <cs:fillRef idx="0"/>
+    <cs:effectRef idx="0"/>
+    <cs:fontRef idx="minor">
+      <a:schemeClr val="tx1"/>
+    </cs:fontRef>
+  </cs:plotArea>
+  <cs:plotArea3D mods="allowNoFillOverride allowNoLineOverride">
+    <cs:lnRef idx="0"/>
+    <cs:fillRef idx="0"/>
+    <cs:effectRef idx="0"/>
+    <cs:fontRef idx="minor">
+      <a:schemeClr val="tx1"/>
+    </cs:fontRef>
+  </cs:plotArea3D>
+  <cs:seriesAxis>
+    <cs:lnRef idx="0"/>
+    <cs:fillRef idx="0"/>
+    <cs:effectRef idx="0"/>
+    <cs:fontRef idx="minor">
+      <a:schemeClr val="tx1">
+        <a:lumMod val="65000"/>
+        <a:lumOff val="35000"/>
+      </a:schemeClr>
+    </cs:fontRef>
+    <cs:spPr>
+      <a:ln w="9525" cap="flat" cmpd="sng" algn="ctr">
+        <a:solidFill>
+          <a:schemeClr val="tx1">
+            <a:lumMod val="15000"/>
+            <a:lumOff val="85000"/>
+          </a:schemeClr>
+        </a:solidFill>
+        <a:round/>
+      </a:ln>
+    </cs:spPr>
+    <cs:defRPr sz="900"/>
+  </cs:seriesAxis>
+  <cs:seriesLine>
+    <cs:lnRef idx="0"/>
+    <cs:fillRef idx="0"/>
+    <cs:effectRef idx="0"/>
+    <cs:fontRef idx="minor">
+      <a:schemeClr val="tx1"/>
+    </cs:fontRef>
+    <cs:spPr>
+      <a:ln w="9525" cap="flat">
+        <a:solidFill>
+          <a:srgbClr val="D9D9D9"/>
+        </a:solidFill>
+        <a:round/>
+      </a:ln>
+    </cs:spPr>
+  </cs:seriesLine>
+  <cs:title>
+    <cs:lnRef idx="0"/>
+    <cs:fillRef idx="0"/>
+    <cs:effectRef idx="0"/>
+    <cs:fontRef idx="minor">
+      <a:schemeClr val="tx1">
+        <a:lumMod val="65000"/>
+        <a:lumOff val="35000"/>
+      </a:schemeClr>
+    </cs:fontRef>
+    <cs:defRPr sz="1400"/>
+  </cs:title>
+  <cs:trendline>
+    <cs:lnRef idx="0">
+      <cs:styleClr val="auto"/>
+    </cs:lnRef>
+    <cs:fillRef idx="0"/>
+    <cs:effectRef idx="0"/>
+    <cs:fontRef idx="minor">
+      <a:schemeClr val="tx1"/>
+    </cs:fontRef>
+    <cs:spPr>
+      <a:ln w="19050" cap="rnd">
+        <a:solidFill>
+          <a:schemeClr val="phClr"/>
+        </a:solidFill>
+        <a:prstDash val="sysDash"/>
+      </a:ln>
+    </cs:spPr>
+  </cs:trendline>
+  <cs:trendlineLabel>
+    <cs:lnRef idx="0"/>
+    <cs:fillRef idx="0"/>
+    <cs:effectRef idx="0"/>
+    <cs:fontRef idx="minor">
+      <a:schemeClr val="tx1">
+        <a:lumMod val="65000"/>
+        <a:lumOff val="35000"/>
+      </a:schemeClr>
+    </cs:fontRef>
+    <cs:defRPr sz="900"/>
+  </cs:trendlineLabel>
+  <cs:upBar>
+    <cs:lnRef idx="0"/>
+    <cs:fillRef idx="0"/>
+    <cs:effectRef idx="0"/>
+    <cs:fontRef idx="minor">
+      <a:schemeClr val="dk1"/>
+    </cs:fontRef>
+    <cs:spPr>
+      <a:solidFill>
+        <a:schemeClr val="lt1"/>
+      </a:solidFill>
+      <a:ln w="9525">
+        <a:solidFill>
+          <a:schemeClr val="tx1">
+            <a:lumMod val="15000"/>
+            <a:lumOff val="85000"/>
+          </a:schemeClr>
+        </a:solidFill>
+      </a:ln>
+    </cs:spPr>
+  </cs:upBar>
+  <cs:valueAxis>
+    <cs:lnRef idx="0"/>
+    <cs:fillRef idx="0"/>
+    <cs:effectRef idx="0"/>
+    <cs:fontRef idx="minor">
+      <a:schemeClr val="tx1">
+        <a:lumMod val="65000"/>
+        <a:lumOff val="35000"/>
+      </a:schemeClr>
+    </cs:fontRef>
+    <cs:defRPr sz="900"/>
+  </cs:valueAxis>
+  <cs:wall>
+    <cs:lnRef idx="0"/>
+    <cs:fillRef idx="0"/>
+    <cs:effectRef idx="0"/>
+    <cs:fontRef idx="minor">
+      <a:schemeClr val="tx1"/>
+    </cs:fontRef>
+  </cs:wall>
+</cs:chartStyle>
+</file>
+
+<file path=word/charts/style4.xml><?xml version="1.0" encoding="utf-8"?>
+<cs:chartStyle xmlns:cs="http://schemas.microsoft.com/office/drawing/2012/chartStyle" xmlns:a="http://schemas.openxmlformats.org/drawingml/2006/main" id="269">
+  <cs:axisTitle>
+    <cs:lnRef idx="0"/>
+    <cs:fillRef idx="0"/>
+    <cs:effectRef idx="0"/>
+    <cs:fontRef idx="minor">
+      <a:schemeClr val="tx1">
+        <a:lumMod val="65000"/>
+        <a:lumOff val="35000"/>
+      </a:schemeClr>
+    </cs:fontRef>
+    <cs:defRPr sz="1000" kern="1200"/>
+  </cs:axisTitle>
+  <cs:categoryAxis>
+    <cs:lnRef idx="0"/>
+    <cs:fillRef idx="0"/>
+    <cs:effectRef idx="0"/>
+    <cs:fontRef idx="minor">
+      <a:schemeClr val="tx1">
+        <a:lumMod val="65000"/>
+        <a:lumOff val="35000"/>
+      </a:schemeClr>
+    </cs:fontRef>
+    <cs:spPr>
+      <a:ln w="9525" cap="flat" cmpd="sng" algn="ctr">
+        <a:solidFill>
+          <a:schemeClr val="tx1">
+            <a:lumMod val="25000"/>
+            <a:lumOff val="75000"/>
+          </a:schemeClr>
+        </a:solidFill>
+        <a:round/>
+      </a:ln>
+    </cs:spPr>
+    <cs:defRPr sz="900" kern="1200"/>
+  </cs:categoryAxis>
+  <cs:chartArea mods="allowNoFillOverride allowNoLineOverride">
+    <cs:lnRef idx="0"/>
+    <cs:fillRef idx="0"/>
+    <cs:effectRef idx="0"/>
+    <cs:fontRef idx="minor">
+      <a:schemeClr val="tx1"/>
+    </cs:fontRef>
+    <cs:spPr>
+      <a:solidFill>
+        <a:schemeClr val="bg1"/>
+      </a:solidFill>
+      <a:ln w="9525" cap="flat" cmpd="sng" algn="ctr">
+        <a:solidFill>
+          <a:schemeClr val="tx1">
+            <a:lumMod val="15000"/>
+            <a:lumOff val="85000"/>
+          </a:schemeClr>
+        </a:solidFill>
+        <a:round/>
+      </a:ln>
+    </cs:spPr>
+    <cs:defRPr sz="1000" kern="1200"/>
+  </cs:chartArea>
+  <cs:dataLabel>
+    <cs:lnRef idx="0"/>
+    <cs:fillRef idx="0"/>
+    <cs:effectRef idx="0"/>
+    <cs:fontRef idx="minor">
+      <a:schemeClr val="tx1">
+        <a:lumMod val="75000"/>
+        <a:lumOff val="25000"/>
+      </a:schemeClr>
+    </cs:fontRef>
+    <cs:defRPr sz="900" kern="1200"/>
+  </cs:dataLabel>
+  <cs:dataLabelCallout>
+    <cs:lnRef idx="0"/>
+    <cs:fillRef idx="0"/>
+    <cs:effectRef idx="0"/>
+    <cs:fontRef idx="minor">
+      <a:schemeClr val="dk1">
+        <a:lumMod val="65000"/>
+        <a:lumOff val="35000"/>
+      </a:schemeClr>
+    </cs:fontRef>
+    <cs:spPr>
+      <a:solidFill>
+        <a:schemeClr val="lt1"/>
+      </a:solidFill>
+      <a:ln>
+        <a:solidFill>
+          <a:schemeClr val="dk1">
+            <a:lumMod val="25000"/>
+            <a:lumOff val="75000"/>
+          </a:schemeClr>
+        </a:solidFill>
+      </a:ln>
+    </cs:spPr>
+    <cs:defRPr sz="900" kern="1200"/>
+    <cs:bodyPr rot="0" spcFirstLastPara="1" vertOverflow="clip" horzOverflow="clip" vert="horz" wrap="square" lIns="36576" tIns="18288" rIns="36576" bIns="18288" anchor="ctr" anchorCtr="1">
+      <a:spAutoFit/>
+    </cs:bodyPr>
+  </cs:dataLabelCallout>
+  <cs:dataPoint>
+    <cs:lnRef idx="0"/>
+    <cs:fillRef idx="1">
+      <cs:styleClr val="auto"/>
+    </cs:fillRef>
+    <cs:effectRef idx="0"/>
+    <cs:fontRef idx="minor">
+      <a:schemeClr val="tx1"/>
+    </cs:fontRef>
+    <cs:spPr>
+      <a:solidFill>
+        <a:schemeClr val="phClr">
+          <a:alpha val="75000"/>
+        </a:schemeClr>
+      </a:solidFill>
+    </cs:spPr>
+  </cs:dataPoint>
+  <cs:dataPoint3D>
+    <cs:lnRef idx="0"/>
+    <cs:fillRef idx="1">
+      <cs:styleClr val="auto"/>
+    </cs:fillRef>
+    <cs:effectRef idx="0"/>
+    <cs:fontRef idx="minor">
+      <a:schemeClr val="tx1"/>
+    </cs:fontRef>
+    <cs:spPr>
+      <a:solidFill>
+        <a:schemeClr val="phClr">
+          <a:alpha val="75000"/>
+        </a:schemeClr>
+      </a:solidFill>
+    </cs:spPr>
+  </cs:dataPoint3D>
+  <cs:dataPointLine>
+    <cs:lnRef idx="0">
+      <cs:styleClr val="auto"/>
+    </cs:lnRef>
+    <cs:fillRef idx="1"/>
+    <cs:effectRef idx="0"/>
+    <cs:fontRef idx="minor">
+      <a:schemeClr val="tx1"/>
+    </cs:fontRef>
+    <cs:spPr>
+      <a:ln w="19050" cap="rnd">
+        <a:solidFill>
+          <a:schemeClr val="phClr">
+            <a:alpha val="50000"/>
+          </a:schemeClr>
+        </a:solidFill>
+        <a:round/>
+      </a:ln>
+    </cs:spPr>
+  </cs:dataPointLine>
+  <cs:dataPointMarker>
+    <cs:lnRef idx="0">
+      <cs:styleClr val="auto"/>
+    </cs:lnRef>
+    <cs:fillRef idx="1">
+      <cs:styleClr val="auto"/>
+    </cs:fillRef>
+    <cs:effectRef idx="0"/>
+    <cs:fontRef idx="minor">
+      <a:schemeClr val="tx1"/>
+    </cs:fontRef>
+    <cs:spPr>
+      <a:solidFill>
+        <a:schemeClr val="phClr"/>
+      </a:solidFill>
+      <a:ln w="9525">
+        <a:solidFill>
+          <a:schemeClr val="phClr"/>
+        </a:solidFill>
+      </a:ln>
+    </cs:spPr>
+  </cs:dataPointMarker>
+  <cs:dataPointMarkerLayout symbol="circle" size="5"/>
+  <cs:dataPointWireframe>
+    <cs:lnRef idx="0">
+      <cs:styleClr val="auto"/>
+    </cs:lnRef>
+    <cs:fillRef idx="0"/>
+    <cs:effectRef idx="0"/>
+    <cs:fontRef idx="minor">
+      <a:schemeClr val="dk1"/>
+    </cs:fontRef>
+    <cs:spPr>
+      <a:ln w="9525" cap="rnd">
+        <a:solidFill>
+          <a:schemeClr val="phClr"/>
+        </a:solidFill>
+        <a:round/>
+      </a:ln>
+    </cs:spPr>
+  </cs:dataPointWireframe>
+  <cs:dataTable>
+    <cs:lnRef idx="0"/>
+    <cs:fillRef idx="0"/>
+    <cs:effectRef idx="0"/>
+    <cs:fontRef idx="minor">
+      <a:schemeClr val="tx1">
+        <a:lumMod val="65000"/>
+        <a:lumOff val="35000"/>
+      </a:schemeClr>
+    </cs:fontRef>
+    <cs:spPr>
+      <a:noFill/>
+      <a:ln w="9525" cap="flat" cmpd="sng" algn="ctr">
+        <a:solidFill>
+          <a:schemeClr val="tx1">
+            <a:lumMod val="15000"/>
+            <a:lumOff val="85000"/>
+          </a:schemeClr>
+        </a:solidFill>
+        <a:round/>
+      </a:ln>
+    </cs:spPr>
+    <cs:defRPr sz="900" kern="1200"/>
+  </cs:dataTable>
+  <cs:downBar>
+    <cs:lnRef idx="0"/>
+    <cs:fillRef idx="0"/>
+    <cs:effectRef idx="0"/>
+    <cs:fontRef idx="minor">
+      <a:schemeClr val="tx1"/>
+    </cs:fontRef>
+    <cs:spPr>
+      <a:solidFill>
+        <a:schemeClr val="dk1">
+          <a:lumMod val="75000"/>
+          <a:lumOff val="25000"/>
+        </a:schemeClr>
+      </a:solidFill>
+      <a:ln w="9525" cap="flat" cmpd="sng" algn="ctr">
+        <a:solidFill>
+          <a:schemeClr val="tx1">
+            <a:lumMod val="65000"/>
+            <a:lumOff val="35000"/>
+          </a:schemeClr>
+        </a:solidFill>
+        <a:round/>
+      </a:ln>
+    </cs:spPr>
+  </cs:downBar>
+  <cs:dropLine>
+    <cs:lnRef idx="0"/>
+    <cs:fillRef idx="0"/>
+    <cs:effectRef idx="0"/>
+    <cs:fontRef idx="minor">
+      <a:schemeClr val="tx1"/>
+    </cs:fontRef>
+    <cs:spPr>
+      <a:ln w="9525" cap="flat" cmpd="sng" algn="ctr">
+        <a:solidFill>
+          <a:schemeClr val="tx1">
+            <a:lumMod val="35000"/>
+            <a:lumOff val="65000"/>
+          </a:schemeClr>
+        </a:solidFill>
+        <a:round/>
+      </a:ln>
+    </cs:spPr>
+  </cs:dropLine>
+  <cs:errorBar>
+    <cs:lnRef idx="0"/>
+    <cs:fillRef idx="0"/>
+    <cs:effectRef idx="0"/>
+    <cs:fontRef idx="minor">
+      <a:schemeClr val="tx1"/>
+    </cs:fontRef>
+    <cs:spPr>
+      <a:ln w="9525" cap="flat" cmpd="sng" algn="ctr">
+        <a:solidFill>
+          <a:schemeClr val="tx1">
+            <a:lumMod val="65000"/>
+            <a:lumOff val="35000"/>
+          </a:schemeClr>
+        </a:solidFill>
+        <a:round/>
+      </a:ln>
+    </cs:spPr>
+  </cs:errorBar>
+  <cs:floor>
+    <cs:lnRef idx="0"/>
+    <cs:fillRef idx="0"/>
+    <cs:effectRef idx="0"/>
+    <cs:fontRef idx="minor">
+      <a:schemeClr val="tx1"/>
+    </cs:fontRef>
+    <cs:spPr>
+      <a:noFill/>
+      <a:ln>
+        <a:noFill/>
+      </a:ln>
+    </cs:spPr>
+  </cs:floor>
+  <cs:gridlineMajor>
+    <cs:lnRef idx="0"/>
+    <cs:fillRef idx="0"/>
+    <cs:effectRef idx="0"/>
+    <cs:fontRef idx="minor">
+      <a:schemeClr val="tx1"/>
+    </cs:fontRef>
+    <cs:spPr>
+      <a:ln w="9525" cap="flat" cmpd="sng" algn="ctr">
+        <a:solidFill>
+          <a:schemeClr val="tx1">
+            <a:lumMod val="15000"/>
+            <a:lumOff val="85000"/>
+          </a:schemeClr>
+        </a:solidFill>
+        <a:round/>
+      </a:ln>
+    </cs:spPr>
+  </cs:gridlineMajor>
+  <cs:gridlineMinor>
+    <cs:lnRef idx="0"/>
+    <cs:fillRef idx="0"/>
+    <cs:effectRef idx="0"/>
+    <cs:fontRef idx="minor">
+      <a:schemeClr val="tx1"/>
+    </cs:fontRef>
+    <cs:spPr>
+      <a:ln w="9525" cap="flat" cmpd="sng" algn="ctr">
+        <a:solidFill>
+          <a:schemeClr val="tx1">
+            <a:lumMod val="5000"/>
+            <a:lumOff val="95000"/>
+          </a:schemeClr>
+        </a:solidFill>
+        <a:round/>
+      </a:ln>
+    </cs:spPr>
+  </cs:gridlineMinor>
+  <cs:hiLoLine>
+    <cs:lnRef idx="0"/>
+    <cs:fillRef idx="0"/>
+    <cs:effectRef idx="0"/>
+    <cs:fontRef idx="minor">
+      <a:schemeClr val="tx1"/>
+    </cs:fontRef>
+    <cs:spPr>
+      <a:ln w="9525" cap="flat" cmpd="sng" algn="ctr">
+        <a:solidFill>
+          <a:schemeClr val="tx1">
+            <a:lumMod val="50000"/>
+            <a:lumOff val="50000"/>
+          </a:schemeClr>
+        </a:solidFill>
+        <a:round/>
+      </a:ln>
+    </cs:spPr>
+  </cs:hiLoLine>
+  <cs:leaderLine>
+    <cs:lnRef idx="0"/>
+    <cs:fillRef idx="0"/>
+    <cs:effectRef idx="0"/>
+    <cs:fontRef idx="minor">
+      <a:schemeClr val="tx1"/>
+    </cs:fontRef>
+    <cs:spPr>
+      <a:ln w="9525" cap="flat" cmpd="sng" algn="ctr">
+        <a:solidFill>
+          <a:schemeClr val="tx1">
+            <a:lumMod val="35000"/>
+            <a:lumOff val="65000"/>
+          </a:schemeClr>
+        </a:solidFill>
+        <a:round/>
+      </a:ln>
+    </cs:spPr>
+  </cs:leaderLine>
+  <cs:legend>
+    <cs:lnRef idx="0"/>
+    <cs:fillRef idx="0"/>
+    <cs:effectRef idx="0"/>
+    <cs:fontRef idx="minor">
+      <a:schemeClr val="tx1">
+        <a:lumMod val="65000"/>
+        <a:lumOff val="35000"/>
+      </a:schemeClr>
+    </cs:fontRef>
+    <cs:defRPr sz="900" kern="1200"/>
+  </cs:legend>
+  <cs:plotArea mods="allowNoFillOverride allowNoLineOverride">
+    <cs:lnRef idx="0"/>
+    <cs:fillRef idx="0"/>
+    <cs:effectRef idx="0"/>
+    <cs:fontRef idx="minor">
+      <a:schemeClr val="tx1"/>
+    </cs:fontRef>
+  </cs:plotArea>
+  <cs:plotArea3D mods="allowNoFillOverride allowNoLineOverride">
+    <cs:lnRef idx="0"/>
+    <cs:fillRef idx="0"/>
+    <cs:effectRef idx="0"/>
+    <cs:fontRef idx="minor">
+      <a:schemeClr val="tx1"/>
+    </cs:fontRef>
+  </cs:plotArea3D>
+  <cs:seriesAxis>
+    <cs:lnRef idx="0"/>
+    <cs:fillRef idx="0"/>
+    <cs:effectRef idx="0"/>
+    <cs:fontRef idx="minor">
+      <a:schemeClr val="tx1">
+        <a:lumMod val="65000"/>
+        <a:lumOff val="35000"/>
+      </a:schemeClr>
+    </cs:fontRef>
+    <cs:defRPr sz="900" kern="1200"/>
+  </cs:seriesAxis>
+  <cs:seriesLine>
+    <cs:lnRef idx="0"/>
+    <cs:fillRef idx="0"/>
+    <cs:effectRef idx="0"/>
+    <cs:fontRef idx="minor">
+      <a:schemeClr val="tx1"/>
+    </cs:fontRef>
+    <cs:spPr>
+      <a:ln w="9525" cap="flat" cmpd="sng" algn="ctr">
+        <a:solidFill>
+          <a:schemeClr val="tx1">
+            <a:lumMod val="35000"/>
+            <a:lumOff val="65000"/>
+          </a:schemeClr>
+        </a:solidFill>
+        <a:round/>
+      </a:ln>
+    </cs:spPr>
+  </cs:seriesLine>
+  <cs:title>
+    <cs:lnRef idx="0"/>
+    <cs:fillRef idx="0"/>
+    <cs:effectRef idx="0"/>
+    <cs:fontRef idx="minor">
+      <a:schemeClr val="tx1">
+        <a:lumMod val="65000"/>
+        <a:lumOff val="35000"/>
+      </a:schemeClr>
+    </cs:fontRef>
+    <cs:defRPr sz="1400" b="0" kern="1200" spc="0" baseline="0"/>
+  </cs:title>
+  <cs:trendline>
+    <cs:lnRef idx="0">
+      <cs:styleClr val="auto"/>
+    </cs:lnRef>
+    <cs:fillRef idx="0"/>
+    <cs:effectRef idx="0"/>
+    <cs:fontRef idx="minor">
+      <a:schemeClr val="tx1"/>
+    </cs:fontRef>
+    <cs:spPr>
+      <a:ln w="19050" cap="rnd">
+        <a:solidFill>
+          <a:schemeClr val="phClr"/>
+        </a:solidFill>
+        <a:prstDash val="sysDot"/>
+      </a:ln>
+    </cs:spPr>
+  </cs:trendline>
+  <cs:trendlineLabel>
+    <cs:lnRef idx="0"/>
+    <cs:fillRef idx="0"/>
+    <cs:effectRef idx="0"/>
+    <cs:fontRef idx="minor">
+      <a:schemeClr val="tx1">
+        <a:lumMod val="65000"/>
+        <a:lumOff val="35000"/>
+      </a:schemeClr>
+    </cs:fontRef>
+    <cs:defRPr sz="900" kern="1200"/>
+  </cs:trendlineLabel>
+  <cs:upBar>
+    <cs:lnRef idx="0"/>
+    <cs:fillRef idx="0"/>
+    <cs:effectRef idx="0"/>
+    <cs:fontRef idx="minor">
+      <a:schemeClr val="tx1"/>
+    </cs:fontRef>
+    <cs:spPr>
+      <a:solidFill>
+        <a:schemeClr val="lt1"/>
+      </a:solidFill>
+      <a:ln w="9525" cap="flat" cmpd="sng" algn="ctr">
+        <a:solidFill>
+          <a:schemeClr val="tx1">
+            <a:lumMod val="65000"/>
+            <a:lumOff val="35000"/>
+          </a:schemeClr>
+        </a:solidFill>
+        <a:round/>
+      </a:ln>
+    </cs:spPr>
+  </cs:upBar>
+  <cs:valueAxis>
+    <cs:lnRef idx="0"/>
+    <cs:fillRef idx="0"/>
+    <cs:effectRef idx="0"/>
+    <cs:fontRef idx="minor">
+      <a:schemeClr val="tx1">
+        <a:lumMod val="65000"/>
+        <a:lumOff val="35000"/>
+      </a:schemeClr>
+    </cs:fontRef>
+    <cs:spPr>
+      <a:ln w="9525" cap="flat" cmpd="sng" algn="ctr">
+        <a:solidFill>
+          <a:schemeClr val="tx1">
+            <a:lumMod val="25000"/>
+            <a:lumOff val="75000"/>
+          </a:schemeClr>
+        </a:solidFill>
+        <a:round/>
+      </a:ln>
+    </cs:spPr>
+    <cs:defRPr sz="900" kern="1200"/>
+  </cs:valueAxis>
+  <cs:wall>
+    <cs:lnRef idx="0"/>
+    <cs:fillRef idx="0"/>
+    <cs:effectRef idx="0"/>
+    <cs:fontRef idx="minor">
+      <a:schemeClr val="tx1"/>
+    </cs:fontRef>
+    <cs:spPr>
+      <a:noFill/>
+      <a:ln>
+        <a:noFill/>
+      </a:ln>
+    </cs:spPr>
+  </cs:wall>
+</cs:chartStyle>
+</file>
+
+<file path=word/charts/style5.xml><?xml version="1.0" encoding="utf-8"?>
+<cs:chartStyle xmlns:cs="http://schemas.microsoft.com/office/drawing/2012/chartStyle" xmlns:a="http://schemas.openxmlformats.org/drawingml/2006/main" id="201">
+  <cs:axisTitle>
+    <cs:lnRef idx="0"/>
+    <cs:fillRef idx="0"/>
+    <cs:effectRef idx="0"/>
+    <cs:fontRef idx="minor">
+      <a:schemeClr val="tx1">
+        <a:lumMod val="65000"/>
+        <a:lumOff val="35000"/>
+      </a:schemeClr>
+    </cs:fontRef>
+    <cs:defRPr sz="1000" kern="1200"/>
+  </cs:axisTitle>
+  <cs:categoryAxis>
+    <cs:lnRef idx="0"/>
+    <cs:fillRef idx="0"/>
+    <cs:effectRef idx="0"/>
+    <cs:fontRef idx="minor">
+      <a:schemeClr val="tx1">
+        <a:lumMod val="65000"/>
+        <a:lumOff val="35000"/>
+      </a:schemeClr>
+    </cs:fontRef>
+    <cs:spPr>
+      <a:ln w="9525" cap="flat" cmpd="sng" algn="ctr">
+        <a:solidFill>
+          <a:schemeClr val="tx1">
+            <a:lumMod val="15000"/>
+            <a:lumOff val="85000"/>
+          </a:schemeClr>
+        </a:solidFill>
+        <a:round/>
+      </a:ln>
+    </cs:spPr>
+    <cs:defRPr sz="900" kern="1200"/>
+  </cs:categoryAxis>
+  <cs:chartArea mods="allowNoFillOverride allowNoLineOverride">
+    <cs:lnRef idx="0"/>
+    <cs:fillRef idx="0"/>
+    <cs:effectRef idx="0"/>
+    <cs:fontRef idx="minor">
+      <a:schemeClr val="tx1"/>
+    </cs:fontRef>
+    <cs:spPr>
+      <a:solidFill>
+        <a:schemeClr val="bg1"/>
+      </a:solidFill>
+      <a:ln w="9525" cap="flat" cmpd="sng" algn="ctr">
+        <a:solidFill>
+          <a:schemeClr val="tx1">
+            <a:lumMod val="15000"/>
+            <a:lumOff val="85000"/>
+          </a:schemeClr>
+        </a:solidFill>
+        <a:round/>
+      </a:ln>
+    </cs:spPr>
+    <cs:defRPr sz="1000" kern="1200"/>
+  </cs:chartArea>
+  <cs:dataLabel>
+    <cs:lnRef idx="0"/>
+    <cs:fillRef idx="0"/>
+    <cs:effectRef idx="0"/>
+    <cs:fontRef idx="minor">
+      <a:schemeClr val="tx1">
+        <a:lumMod val="75000"/>
+        <a:lumOff val="25000"/>
+      </a:schemeClr>
+    </cs:fontRef>
+    <cs:defRPr sz="900" kern="1200"/>
+  </cs:dataLabel>
+  <cs:dataLabelCallout>
+    <cs:lnRef idx="0"/>
+    <cs:fillRef idx="0"/>
+    <cs:effectRef idx="0"/>
+    <cs:fontRef idx="minor">
+      <a:schemeClr val="dk1">
+        <a:lumMod val="65000"/>
+        <a:lumOff val="35000"/>
+      </a:schemeClr>
+    </cs:fontRef>
+    <cs:spPr>
+      <a:solidFill>
+        <a:schemeClr val="lt1"/>
+      </a:solidFill>
+      <a:ln>
+        <a:solidFill>
+          <a:schemeClr val="dk1">
+            <a:lumMod val="25000"/>
+            <a:lumOff val="75000"/>
+          </a:schemeClr>
+        </a:solidFill>
+      </a:ln>
+    </cs:spPr>
+    <cs:defRPr sz="900" kern="1200"/>
+    <cs:bodyPr rot="0" spcFirstLastPara="1" vertOverflow="clip" horzOverflow="clip" vert="horz" wrap="square" lIns="36576" tIns="18288" rIns="36576" bIns="18288" anchor="ctr" anchorCtr="1">
+      <a:spAutoFit/>
+    </cs:bodyPr>
+  </cs:dataLabelCallout>
+  <cs:dataPoint>
+    <cs:lnRef idx="0"/>
+    <cs:fillRef idx="1">
+      <cs:styleClr val="auto"/>
+    </cs:fillRef>
+    <cs:effectRef idx="0"/>
+    <cs:fontRef idx="minor">
+      <a:schemeClr val="tx1"/>
+    </cs:fontRef>
+  </cs:dataPoint>
+  <cs:dataPoint3D>
+    <cs:lnRef idx="0"/>
+    <cs:fillRef idx="1">
+      <cs:styleClr val="auto"/>
+    </cs:fillRef>
+    <cs:effectRef idx="0"/>
+    <cs:fontRef idx="minor">
+      <a:schemeClr val="tx1"/>
+    </cs:fontRef>
+  </cs:dataPoint3D>
+  <cs:dataPointLine>
+    <cs:lnRef idx="0">
+      <cs:styleClr val="auto"/>
+    </cs:lnRef>
+    <cs:fillRef idx="1"/>
+    <cs:effectRef idx="0"/>
+    <cs:fontRef idx="minor">
+      <a:schemeClr val="tx1"/>
+    </cs:fontRef>
+    <cs:spPr>
+      <a:ln w="28575" cap="rnd">
+        <a:solidFill>
+          <a:schemeClr val="phClr"/>
+        </a:solidFill>
+        <a:round/>
+      </a:ln>
+    </cs:spPr>
+  </cs:dataPointLine>
+  <cs:dataPointMarker>
+    <cs:lnRef idx="0">
+      <cs:styleClr val="auto"/>
+    </cs:lnRef>
+    <cs:fillRef idx="1">
+      <cs:styleClr val="auto"/>
+    </cs:fillRef>
+    <cs:effectRef idx="0"/>
+    <cs:fontRef idx="minor">
+      <a:schemeClr val="tx1"/>
+    </cs:fontRef>
+    <cs:spPr>
+      <a:ln w="9525">
+        <a:solidFill>
+          <a:schemeClr val="phClr"/>
+        </a:solidFill>
+      </a:ln>
+    </cs:spPr>
+  </cs:dataPointMarker>
+  <cs:dataPointMarkerLayout symbol="circle" size="5"/>
+  <cs:dataPointWireframe>
+    <cs:lnRef idx="0">
+      <cs:styleClr val="auto"/>
+    </cs:lnRef>
+    <cs:fillRef idx="1"/>
+    <cs:effectRef idx="0"/>
+    <cs:fontRef idx="minor">
+      <a:schemeClr val="tx1"/>
+    </cs:fontRef>
+    <cs:spPr>
+      <a:ln w="9525" cap="rnd">
+        <a:solidFill>
+          <a:schemeClr val="phClr"/>
+        </a:solidFill>
+        <a:round/>
+      </a:ln>
+    </cs:spPr>
+  </cs:dataPointWireframe>
+  <cs:dataTable>
+    <cs:lnRef idx="0"/>
+    <cs:fillRef idx="0"/>
+    <cs:effectRef idx="0"/>
+    <cs:fontRef idx="minor">
+      <a:schemeClr val="tx1">
+        <a:lumMod val="65000"/>
+        <a:lumOff val="35000"/>
+      </a:schemeClr>
+    </cs:fontRef>
+    <cs:spPr>
+      <a:noFill/>
+      <a:ln w="9525" cap="flat" cmpd="sng" algn="ctr">
+        <a:solidFill>
+          <a:schemeClr val="tx1">
+            <a:lumMod val="15000"/>
+            <a:lumOff val="85000"/>
+          </a:schemeClr>
+        </a:solidFill>
+        <a:round/>
+      </a:ln>
+    </cs:spPr>
+    <cs:defRPr sz="900" kern="1200"/>
+  </cs:dataTable>
+  <cs:downBar>
+    <cs:lnRef idx="0"/>
+    <cs:fillRef idx="0"/>
+    <cs:effectRef idx="0"/>
+    <cs:fontRef idx="minor">
+      <a:schemeClr val="dk1"/>
+    </cs:fontRef>
+    <cs:spPr>
+      <a:solidFill>
+        <a:schemeClr val="dk1">
+          <a:lumMod val="65000"/>
+          <a:lumOff val="35000"/>
+        </a:schemeClr>
+      </a:solidFill>
+      <a:ln w="9525">
+        <a:solidFill>
+          <a:schemeClr val="tx1">
+            <a:lumMod val="65000"/>
+            <a:lumOff val="35000"/>
+          </a:schemeClr>
+        </a:solidFill>
+      </a:ln>
+    </cs:spPr>
+  </cs:downBar>
+  <cs:dropLine>
+    <cs:lnRef idx="0"/>
+    <cs:fillRef idx="0"/>
+    <cs:effectRef idx="0"/>
+    <cs:fontRef idx="minor">
+      <a:schemeClr val="tx1"/>
+    </cs:fontRef>
+    <cs:spPr>
+      <a:ln w="9525" cap="flat" cmpd="sng" algn="ctr">
+        <a:solidFill>
+          <a:schemeClr val="tx1">
+            <a:lumMod val="35000"/>
+            <a:lumOff val="65000"/>
+          </a:schemeClr>
+        </a:solidFill>
+        <a:round/>
+      </a:ln>
+    </cs:spPr>
+  </cs:dropLine>
+  <cs:errorBar>
+    <cs:lnRef idx="0"/>
+    <cs:fillRef idx="0"/>
+    <cs:effectRef idx="0"/>
+    <cs:fontRef idx="minor">
+      <a:schemeClr val="tx1"/>
+    </cs:fontRef>
+    <cs:spPr>
+      <a:ln w="9525" cap="flat" cmpd="sng" algn="ctr">
+        <a:solidFill>
+          <a:schemeClr val="tx1">
+            <a:lumMod val="65000"/>
+            <a:lumOff val="35000"/>
+          </a:schemeClr>
+        </a:solidFill>
+        <a:round/>
+      </a:ln>
+    </cs:spPr>
+  </cs:errorBar>
+  <cs:floor>
+    <cs:lnRef idx="0"/>
+    <cs:fillRef idx="0"/>
+    <cs:effectRef idx="0"/>
+    <cs:fontRef idx="minor">
+      <a:schemeClr val="tx1"/>
+    </cs:fontRef>
+    <cs:spPr>
+      <a:noFill/>
+      <a:ln>
+        <a:noFill/>
+      </a:ln>
+    </cs:spPr>
+  </cs:floor>
+  <cs:gridlineMajor>
+    <cs:lnRef idx="0"/>
+    <cs:fillRef idx="0"/>
+    <cs:effectRef idx="0"/>
+    <cs:fontRef idx="minor">
+      <a:schemeClr val="tx1"/>
+    </cs:fontRef>
+    <cs:spPr>
+      <a:ln w="9525" cap="flat" cmpd="sng" algn="ctr">
+        <a:solidFill>
+          <a:schemeClr val="tx1">
+            <a:lumMod val="15000"/>
+            <a:lumOff val="85000"/>
+          </a:schemeClr>
+        </a:solidFill>
+        <a:round/>
+      </a:ln>
+    </cs:spPr>
+  </cs:gridlineMajor>
+  <cs:gridlineMinor>
+    <cs:lnRef idx="0"/>
+    <cs:fillRef idx="0"/>
+    <cs:effectRef idx="0"/>
+    <cs:fontRef idx="minor">
+      <a:schemeClr val="tx1"/>
+    </cs:fontRef>
+    <cs:spPr>
+      <a:ln w="9525" cap="flat" cmpd="sng" algn="ctr">
+        <a:solidFill>
+          <a:schemeClr val="tx1">
+            <a:lumMod val="5000"/>
+            <a:lumOff val="95000"/>
+          </a:schemeClr>
+        </a:solidFill>
+        <a:round/>
+      </a:ln>
+    </cs:spPr>
+  </cs:gridlineMinor>
+  <cs:hiLoLine>
+    <cs:lnRef idx="0"/>
+    <cs:fillRef idx="0"/>
+    <cs:effectRef idx="0"/>
+    <cs:fontRef idx="minor">
+      <a:schemeClr val="tx1"/>
+    </cs:fontRef>
+    <cs:spPr>
+      <a:ln w="9525" cap="flat" cmpd="sng" algn="ctr">
+        <a:solidFill>
+          <a:schemeClr val="tx1">
+            <a:lumMod val="75000"/>
+            <a:lumOff val="25000"/>
+          </a:schemeClr>
+        </a:solidFill>
+        <a:round/>
+      </a:ln>
+    </cs:spPr>
+  </cs:hiLoLine>
+  <cs:leaderLine>
+    <cs:lnRef idx="0"/>
+    <cs:fillRef idx="0"/>
+    <cs:effectRef idx="0"/>
+    <cs:fontRef idx="minor">
+      <a:schemeClr val="tx1"/>
+    </cs:fontRef>
+    <cs:spPr>
+      <a:ln w="9525" cap="flat" cmpd="sng" algn="ctr">
+        <a:solidFill>
+          <a:schemeClr val="tx1">
+            <a:lumMod val="35000"/>
+            <a:lumOff val="65000"/>
+          </a:schemeClr>
+        </a:solidFill>
+        <a:round/>
+      </a:ln>
+    </cs:spPr>
+  </cs:leaderLine>
+  <cs:legend>
+    <cs:lnRef idx="0"/>
+    <cs:fillRef idx="0"/>
+    <cs:effectRef idx="0"/>
+    <cs:fontRef idx="minor">
+      <a:schemeClr val="tx1">
+        <a:lumMod val="65000"/>
+        <a:lumOff val="35000"/>
+      </a:schemeClr>
+    </cs:fontRef>
+    <cs:defRPr sz="900" kern="1200"/>
+  </cs:legend>
+  <cs:plotArea mods="allowNoFillOverride allowNoLineOverride">
+    <cs:lnRef idx="0"/>
+    <cs:fillRef idx="0"/>
+    <cs:effectRef idx="0"/>
+    <cs:fontRef idx="minor">
+      <a:schemeClr val="tx1"/>
+    </cs:fontRef>
+  </cs:plotArea>
+  <cs:plotArea3D mods="allowNoFillOverride allowNoLineOverride">
+    <cs:lnRef idx="0"/>
+    <cs:fillRef idx="0"/>
+    <cs:effectRef idx="0"/>
+    <cs:fontRef idx="minor">
+      <a:schemeClr val="tx1"/>
+    </cs:fontRef>
+  </cs:plotArea3D>
+  <cs:seriesAxis>
+    <cs:lnRef idx="0"/>
+    <cs:fillRef idx="0"/>
+    <cs:effectRef idx="0"/>
+    <cs:fontRef idx="minor">
+      <a:schemeClr val="tx1">
+        <a:lumMod val="65000"/>
+        <a:lumOff val="35000"/>
+      </a:schemeClr>
+    </cs:fontRef>
+    <cs:defRPr sz="900" kern="1200"/>
+  </cs:seriesAxis>
+  <cs:seriesLine>
+    <cs:lnRef idx="0"/>
+    <cs:fillRef idx="0"/>
+    <cs:effectRef idx="0"/>
+    <cs:fontRef idx="minor">
+      <a:schemeClr val="tx1"/>
+    </cs:fontRef>
+    <cs:spPr>
+      <a:ln w="9525" cap="flat" cmpd="sng" algn="ctr">
+        <a:solidFill>
+          <a:schemeClr val="tx1">
+            <a:lumMod val="35000"/>
+            <a:lumOff val="65000"/>
+          </a:schemeClr>
+        </a:solidFill>
+        <a:round/>
+      </a:ln>
+    </cs:spPr>
+  </cs:seriesLine>
+  <cs:title>
+    <cs:lnRef idx="0"/>
+    <cs:fillRef idx="0"/>
+    <cs:effectRef idx="0"/>
+    <cs:fontRef idx="minor">
+      <a:schemeClr val="tx1">
+        <a:lumMod val="65000"/>
+        <a:lumOff val="35000"/>
+      </a:schemeClr>
+    </cs:fontRef>
+    <cs:defRPr sz="1400" b="0" kern="1200" spc="0" baseline="0"/>
+  </cs:title>
+  <cs:trendline>
+    <cs:lnRef idx="0">
+      <cs:styleClr val="auto"/>
+    </cs:lnRef>
+    <cs:fillRef idx="0"/>
+    <cs:effectRef idx="0"/>
+    <cs:fontRef idx="minor">
+      <a:schemeClr val="tx1"/>
+    </cs:fontRef>
+    <cs:spPr>
+      <a:ln w="19050" cap="rnd">
+        <a:solidFill>
+          <a:schemeClr val="phClr"/>
+        </a:solidFill>
+        <a:prstDash val="sysDot"/>
+      </a:ln>
+    </cs:spPr>
+  </cs:trendline>
+  <cs:trendlineLabel>
+    <cs:lnRef idx="0"/>
+    <cs:fillRef idx="0"/>
+    <cs:effectRef idx="0"/>
+    <cs:fontRef idx="minor">
+      <a:schemeClr val="tx1">
+        <a:lumMod val="65000"/>
+        <a:lumOff val="35000"/>
+      </a:schemeClr>
+    </cs:fontRef>
+    <cs:defRPr sz="900" kern="1200"/>
+  </cs:trendlineLabel>
+  <cs:upBar>
+    <cs:lnRef idx="0"/>
+    <cs:fillRef idx="0"/>
+    <cs:effectRef idx="0"/>
+    <cs:fontRef idx="minor">
+      <a:schemeClr val="dk1"/>
+    </cs:fontRef>
+    <cs:spPr>
+      <a:solidFill>
+        <a:schemeClr val="lt1"/>
+      </a:solidFill>
+      <a:ln w="9525">
+        <a:solidFill>
+          <a:schemeClr val="tx1">
+            <a:lumMod val="15000"/>
+            <a:lumOff val="85000"/>
+          </a:schemeClr>
+        </a:solidFill>
+      </a:ln>
+    </cs:spPr>
+  </cs:upBar>
+  <cs:valueAxis>
+    <cs:lnRef idx="0"/>
+    <cs:fillRef idx="0"/>
+    <cs:effectRef idx="0"/>
+    <cs:fontRef idx="minor">
+      <a:schemeClr val="tx1">
+        <a:lumMod val="65000"/>
+        <a:lumOff val="35000"/>
+      </a:schemeClr>
+    </cs:fontRef>
+    <cs:defRPr sz="900" kern="1200"/>
+  </cs:valueAxis>
+  <cs:wall>
+    <cs:lnRef idx="0"/>
+    <cs:fillRef idx="0"/>
+    <cs:effectRef idx="0"/>
+    <cs:fontRef idx="minor">
+      <a:schemeClr val="tx1"/>
+    </cs:fontRef>
+    <cs:spPr>
+      <a:noFill/>
+      <a:ln>
+        <a:noFill/>
+      </a:ln>
+    </cs:spPr>
+  </cs:wall>
+</cs:chartStyle>
+</file>
+
+<file path=word/charts/style6.xml><?xml version="1.0" encoding="utf-8"?>
+<cs:chartStyle xmlns:cs="http://schemas.microsoft.com/office/drawing/2012/chartStyle" xmlns:a="http://schemas.openxmlformats.org/drawingml/2006/main" id="410">
+  <cs:axisTitle>
+    <cs:lnRef idx="0"/>
+    <cs:fillRef idx="0"/>
+    <cs:effectRef idx="0"/>
+    <cs:fontRef idx="minor">
+      <a:schemeClr val="tx1">
+        <a:lumMod val="65000"/>
+        <a:lumOff val="35000"/>
+      </a:schemeClr>
+    </cs:fontRef>
+    <cs:spPr>
+      <a:solidFill>
+        <a:schemeClr val="bg1">
+          <a:lumMod val="65000"/>
+        </a:schemeClr>
+      </a:solidFill>
+      <a:ln w="19050">
+        <a:solidFill>
+          <a:schemeClr val="bg1"/>
+        </a:solidFill>
+      </a:ln>
+    </cs:spPr>
+    <cs:defRPr sz="900"/>
+  </cs:axisTitle>
+  <cs:categoryAxis>
+    <cs:lnRef idx="0"/>
+    <cs:fillRef idx="0"/>
+    <cs:effectRef idx="0"/>
+    <cs:fontRef idx="minor">
+      <a:schemeClr val="tx1">
+        <a:lumMod val="65000"/>
+        <a:lumOff val="35000"/>
+      </a:schemeClr>
+    </cs:fontRef>
+    <cs:spPr>
+      <a:ln w="9525" cap="flat" cmpd="sng" algn="ctr">
+        <a:solidFill>
+          <a:schemeClr val="tx1">
+            <a:lumMod val="15000"/>
+            <a:lumOff val="85000"/>
+          </a:schemeClr>
+        </a:solidFill>
+        <a:round/>
+      </a:ln>
+    </cs:spPr>
+    <cs:defRPr sz="900"/>
+  </cs:categoryAxis>
+  <cs:chartArea mods="allowNoFillOverride allowNoLineOverride">
+    <cs:lnRef idx="0"/>
+    <cs:fillRef idx="0"/>
+    <cs:effectRef idx="0"/>
+    <cs:fontRef idx="minor">
+      <a:schemeClr val="tx1"/>
+    </cs:fontRef>
+    <cs:spPr>
+      <a:solidFill>
+        <a:schemeClr val="bg1"/>
+      </a:solidFill>
+      <a:ln w="9525" cap="flat" cmpd="sng" algn="ctr">
+        <a:solidFill>
+          <a:schemeClr val="tx1">
+            <a:lumMod val="15000"/>
+            <a:lumOff val="85000"/>
+          </a:schemeClr>
+        </a:solidFill>
+        <a:round/>
+      </a:ln>
+    </cs:spPr>
+    <cs:defRPr sz="1000"/>
+  </cs:chartArea>
+  <cs:dataLabel>
+    <cs:lnRef idx="0"/>
+    <cs:fillRef idx="0"/>
+    <cs:effectRef idx="0"/>
+    <cs:fontRef idx="minor">
+      <a:schemeClr val="lt1"/>
+    </cs:fontRef>
+    <cs:defRPr sz="900"/>
+  </cs:dataLabel>
+  <cs:dataLabelCallout>
+    <cs:lnRef idx="0"/>
+    <cs:fillRef idx="0"/>
+    <cs:effectRef idx="0"/>
+    <cs:fontRef idx="minor">
+      <a:schemeClr val="dk1">
+        <a:lumMod val="65000"/>
+        <a:lumOff val="35000"/>
+      </a:schemeClr>
+    </cs:fontRef>
+    <cs:spPr>
+      <a:solidFill>
+        <a:schemeClr val="lt1"/>
+      </a:solidFill>
+      <a:ln>
+        <a:solidFill>
+          <a:schemeClr val="dk1">
+            <a:lumMod val="25000"/>
+            <a:lumOff val="75000"/>
+          </a:schemeClr>
+        </a:solidFill>
+      </a:ln>
+    </cs:spPr>
+    <cs:defRPr sz="900"/>
+    <cs:bodyPr rot="0" spcFirstLastPara="1" vertOverflow="clip" horzOverflow="clip" vert="horz" wrap="square" lIns="36576" tIns="18288" rIns="36576" bIns="18288" anchor="ctr" anchorCtr="1">
+      <a:spAutoFit/>
+    </cs:bodyPr>
+  </cs:dataLabelCallout>
+  <cs:dataPoint>
+    <cs:lnRef idx="0"/>
+    <cs:fillRef idx="0">
+      <cs:styleClr val="auto"/>
+    </cs:fillRef>
+    <cs:effectRef idx="0"/>
+    <cs:fontRef idx="minor">
+      <a:schemeClr val="tx1"/>
+    </cs:fontRef>
+    <cs:spPr>
+      <a:solidFill>
+        <a:schemeClr val="phClr"/>
+      </a:solidFill>
+      <a:ln w="19050">
+        <a:solidFill>
+          <a:schemeClr val="lt1"/>
+        </a:solidFill>
+      </a:ln>
+    </cs:spPr>
+  </cs:dataPoint>
+  <cs:dataPoint3D>
+    <cs:lnRef idx="0"/>
+    <cs:fillRef idx="0">
+      <cs:styleClr val="auto"/>
+    </cs:fillRef>
+    <cs:effectRef idx="0"/>
+    <cs:fontRef idx="minor">
+      <a:schemeClr val="tx1"/>
+    </cs:fontRef>
+    <cs:spPr>
+      <a:solidFill>
+        <a:schemeClr val="phClr"/>
+      </a:solidFill>
+    </cs:spPr>
+  </cs:dataPoint3D>
+  <cs:dataPointLine>
+    <cs:lnRef idx="0">
+      <cs:styleClr val="auto"/>
+    </cs:lnRef>
+    <cs:fillRef idx="0"/>
+    <cs:effectRef idx="0"/>
+    <cs:fontRef idx="minor">
+      <a:schemeClr val="tx1"/>
+    </cs:fontRef>
+    <cs:spPr>
+      <a:ln w="28575" cap="rnd">
+        <a:solidFill>
+          <a:schemeClr val="phClr"/>
+        </a:solidFill>
+        <a:round/>
+      </a:ln>
+    </cs:spPr>
+  </cs:dataPointLine>
+  <cs:dataPointMarker>
+    <cs:lnRef idx="0"/>
+    <cs:fillRef idx="0">
+      <cs:styleClr val="auto"/>
+    </cs:fillRef>
+    <cs:effectRef idx="0"/>
+    <cs:fontRef idx="minor">
+      <a:schemeClr val="tx1"/>
+    </cs:fontRef>
+    <cs:spPr>
+      <a:solidFill>
+        <a:schemeClr val="phClr"/>
+      </a:solidFill>
+      <a:ln w="9525">
+        <a:solidFill>
+          <a:schemeClr val="lt1"/>
+        </a:solidFill>
+      </a:ln>
+    </cs:spPr>
+  </cs:dataPointMarker>
+  <cs:dataPointMarkerLayout symbol="circle" size="5"/>
+  <cs:dataPointWireframe>
+    <cs:lnRef idx="0">
+      <cs:styleClr val="auto"/>
+    </cs:lnRef>
+    <cs:fillRef idx="0"/>
+    <cs:effectRef idx="0"/>
+    <cs:fontRef idx="minor">
+      <a:schemeClr val="tx1"/>
+    </cs:fontRef>
+    <cs:spPr>
+      <a:ln w="28575" cap="rnd">
+        <a:solidFill>
+          <a:schemeClr val="phClr"/>
+        </a:solidFill>
+        <a:round/>
+      </a:ln>
+    </cs:spPr>
+  </cs:dataPointWireframe>
+  <cs:dataTable>
+    <cs:lnRef idx="0"/>
+    <cs:fillRef idx="0"/>
+    <cs:effectRef idx="0"/>
+    <cs:fontRef idx="minor">
+      <a:schemeClr val="tx1">
+        <a:lumMod val="65000"/>
+        <a:lumOff val="35000"/>
+      </a:schemeClr>
+    </cs:fontRef>
+    <cs:spPr>
+      <a:ln w="9525">
+        <a:solidFill>
+          <a:schemeClr val="tx1">
+            <a:lumMod val="15000"/>
+            <a:lumOff val="85000"/>
+          </a:schemeClr>
+        </a:solidFill>
+      </a:ln>
+    </cs:spPr>
+    <cs:defRPr sz="900"/>
+  </cs:dataTable>
+  <cs:downBar>
+    <cs:lnRef idx="0"/>
+    <cs:fillRef idx="0"/>
+    <cs:effectRef idx="0"/>
+    <cs:fontRef idx="minor">
+      <a:schemeClr val="dk1"/>
+    </cs:fontRef>
+    <cs:spPr>
+      <a:solidFill>
+        <a:schemeClr val="dk1">
+          <a:lumMod val="65000"/>
+          <a:lumOff val="35000"/>
+        </a:schemeClr>
+      </a:solidFill>
+      <a:ln w="9525">
+        <a:solidFill>
+          <a:schemeClr val="tx1">
+            <a:lumMod val="65000"/>
+            <a:lumOff val="35000"/>
+          </a:schemeClr>
+        </a:solidFill>
+      </a:ln>
+    </cs:spPr>
+  </cs:downBar>
+  <cs:dropLine>
+    <cs:lnRef idx="0"/>
+    <cs:fillRef idx="0"/>
+    <cs:effectRef idx="0"/>
+    <cs:fontRef idx="minor">
+      <a:schemeClr val="tx1"/>
+    </cs:fontRef>
+    <cs:spPr>
+      <a:ln w="9525" cap="flat" cmpd="sng" algn="ctr">
+        <a:solidFill>
+          <a:schemeClr val="tx1">
+            <a:lumMod val="35000"/>
+            <a:lumOff val="65000"/>
+          </a:schemeClr>
+        </a:solidFill>
+        <a:round/>
+      </a:ln>
+    </cs:spPr>
+  </cs:dropLine>
+  <cs:errorBar>
+    <cs:lnRef idx="0"/>
+    <cs:fillRef idx="0"/>
+    <cs:effectRef idx="0"/>
+    <cs:fontRef idx="minor">
+      <a:schemeClr val="tx1"/>
+    </cs:fontRef>
+    <cs:spPr>
+      <a:ln w="9525" cap="flat" cmpd="sng" algn="ctr">
+        <a:solidFill>
+          <a:schemeClr val="tx1">
+            <a:lumMod val="65000"/>
+            <a:lumOff val="35000"/>
+          </a:schemeClr>
+        </a:solidFill>
+        <a:round/>
+      </a:ln>
+    </cs:spPr>
+  </cs:errorBar>
+  <cs:floor>
+    <cs:lnRef idx="0"/>
+    <cs:fillRef idx="0"/>
+    <cs:effectRef idx="0"/>
+    <cs:fontRef idx="minor">
+      <a:schemeClr val="tx1"/>
+    </cs:fontRef>
+  </cs:floor>
+  <cs:gridlineMajor>
+    <cs:lnRef idx="0"/>
+    <cs:fillRef idx="0"/>
+    <cs:effectRef idx="0"/>
+    <cs:fontRef idx="minor">
+      <a:schemeClr val="tx1"/>
+    </cs:fontRef>
+    <cs:spPr>
+      <a:ln w="9525" cap="flat" cmpd="sng" algn="ctr">
+        <a:solidFill>
+          <a:schemeClr val="tx1">
+            <a:lumMod val="15000"/>
+            <a:lumOff val="85000"/>
+          </a:schemeClr>
+        </a:solidFill>
+        <a:round/>
+      </a:ln>
+    </cs:spPr>
+  </cs:gridlineMajor>
+  <cs:gridlineMinor>
+    <cs:lnRef idx="0"/>
+    <cs:fillRef idx="0"/>
+    <cs:effectRef idx="0"/>
+    <cs:fontRef idx="minor">
+      <a:schemeClr val="tx1"/>
+    </cs:fontRef>
+    <cs:spPr>
+      <a:ln w="9525" cap="flat" cmpd="sng" algn="ctr">
+        <a:solidFill>
+          <a:schemeClr val="tx1">
+            <a:lumMod val="15000"/>
+            <a:lumOff val="85000"/>
+          </a:schemeClr>
+        </a:solidFill>
+        <a:round/>
+      </a:ln>
+    </cs:spPr>
+  </cs:gridlineMinor>
+  <cs:hiLoLine>
+    <cs:lnRef idx="0"/>
+    <cs:fillRef idx="0"/>
+    <cs:effectRef idx="0"/>
+    <cs:fontRef idx="minor">
+      <a:schemeClr val="tx1"/>
+    </cs:fontRef>
+    <cs:spPr>
+      <a:ln w="9525" cap="flat" cmpd="sng" algn="ctr">
+        <a:solidFill>
+          <a:schemeClr val="tx1">
+            <a:lumMod val="75000"/>
+            <a:lumOff val="25000"/>
+          </a:schemeClr>
+        </a:solidFill>
+        <a:round/>
+      </a:ln>
+    </cs:spPr>
+  </cs:hiLoLine>
+  <cs:leaderLine>
+    <cs:lnRef idx="0"/>
+    <cs:fillRef idx="0"/>
+    <cs:effectRef idx="0"/>
+    <cs:fontRef idx="minor">
+      <a:schemeClr val="tx1"/>
+    </cs:fontRef>
+    <cs:spPr>
+      <a:ln w="9525" cap="flat" cmpd="sng" algn="ctr">
+        <a:solidFill>
+          <a:schemeClr val="tx1">
+            <a:lumMod val="35000"/>
+            <a:lumOff val="65000"/>
+          </a:schemeClr>
+        </a:solidFill>
+        <a:round/>
+      </a:ln>
+    </cs:spPr>
+  </cs:leaderLine>
+  <cs:legend>
+    <cs:lnRef idx="0"/>
+    <cs:fillRef idx="0"/>
+    <cs:effectRef idx="0"/>
+    <cs:fontRef idx="minor">
+      <a:schemeClr val="tx1">
+        <a:lumMod val="65000"/>
+        <a:lumOff val="35000"/>
+      </a:schemeClr>
+    </cs:fontRef>
+    <cs:defRPr sz="900"/>
+  </cs:legend>
+  <cs:plotArea mods="allowNoFillOverride allowNoLineOverride">
+    <cs:lnRef idx="0"/>
+    <cs:fillRef idx="0"/>
+    <cs:effectRef idx="0"/>
+    <cs:fontRef idx="minor">
+      <a:schemeClr val="tx1"/>
+    </cs:fontRef>
+  </cs:plotArea>
+  <cs:plotArea3D mods="allowNoFillOverride allowNoLineOverride">
+    <cs:lnRef idx="0"/>
+    <cs:fillRef idx="0"/>
+    <cs:effectRef idx="0"/>
+    <cs:fontRef idx="minor">
+      <a:schemeClr val="tx1"/>
+    </cs:fontRef>
+  </cs:plotArea3D>
+  <cs:seriesAxis>
+    <cs:lnRef idx="0"/>
+    <cs:fillRef idx="0"/>
+    <cs:effectRef idx="0"/>
+    <cs:fontRef idx="minor">
+      <a:schemeClr val="tx1">
+        <a:lumMod val="65000"/>
+        <a:lumOff val="35000"/>
+      </a:schemeClr>
+    </cs:fontRef>
+    <cs:spPr>
+      <a:ln w="9525" cap="flat" cmpd="sng" algn="ctr">
+        <a:solidFill>
+          <a:schemeClr val="tx1">
+            <a:lumMod val="15000"/>
+            <a:lumOff val="85000"/>
+          </a:schemeClr>
+        </a:solidFill>
+        <a:round/>
+      </a:ln>
+    </cs:spPr>
+    <cs:defRPr sz="900"/>
+  </cs:seriesAxis>
+  <cs:seriesLine>
+    <cs:lnRef idx="0"/>
+    <cs:fillRef idx="0"/>
+    <cs:effectRef idx="0"/>
+    <cs:fontRef idx="minor">
+      <a:schemeClr val="tx1"/>
+    </cs:fontRef>
+    <cs:spPr>
+      <a:ln w="9525" cap="flat">
+        <a:solidFill>
+          <a:srgbClr val="D9D9D9"/>
+        </a:solidFill>
+        <a:round/>
+      </a:ln>
+    </cs:spPr>
+  </cs:seriesLine>
+  <cs:title>
+    <cs:lnRef idx="0"/>
+    <cs:fillRef idx="0"/>
+    <cs:effectRef idx="0"/>
+    <cs:fontRef idx="minor">
+      <a:schemeClr val="tx1">
+        <a:lumMod val="65000"/>
+        <a:lumOff val="35000"/>
+      </a:schemeClr>
+    </cs:fontRef>
+    <cs:defRPr sz="1400"/>
+  </cs:title>
+  <cs:trendline>
+    <cs:lnRef idx="0">
+      <cs:styleClr val="auto"/>
+    </cs:lnRef>
+    <cs:fillRef idx="0"/>
+    <cs:effectRef idx="0"/>
+    <cs:fontRef idx="minor">
+      <a:schemeClr val="tx1"/>
+    </cs:fontRef>
+    <cs:spPr>
+      <a:ln w="19050" cap="rnd">
+        <a:solidFill>
+          <a:schemeClr val="phClr"/>
+        </a:solidFill>
+        <a:prstDash val="sysDash"/>
+      </a:ln>
+    </cs:spPr>
+  </cs:trendline>
+  <cs:trendlineLabel>
+    <cs:lnRef idx="0"/>
+    <cs:fillRef idx="0"/>
+    <cs:effectRef idx="0"/>
+    <cs:fontRef idx="minor">
+      <a:schemeClr val="tx1">
+        <a:lumMod val="65000"/>
+        <a:lumOff val="35000"/>
+      </a:schemeClr>
+    </cs:fontRef>
+    <cs:defRPr sz="900"/>
+  </cs:trendlineLabel>
+  <cs:upBar>
+    <cs:lnRef idx="0"/>
+    <cs:fillRef idx="0"/>
+    <cs:effectRef idx="0"/>
+    <cs:fontRef idx="minor">
+      <a:schemeClr val="dk1"/>
+    </cs:fontRef>
+    <cs:spPr>
+      <a:solidFill>
+        <a:schemeClr val="lt1"/>
+      </a:solidFill>
+      <a:ln w="9525">
+        <a:solidFill>
+          <a:schemeClr val="tx1">
+            <a:lumMod val="15000"/>
+            <a:lumOff val="85000"/>
+          </a:schemeClr>
+        </a:solidFill>
+      </a:ln>
+    </cs:spPr>
+  </cs:upBar>
+  <cs:valueAxis>
+    <cs:lnRef idx="0"/>
+    <cs:fillRef idx="0"/>
+    <cs:effectRef idx="0"/>
+    <cs:fontRef idx="minor">
+      <a:schemeClr val="tx1">
+        <a:lumMod val="65000"/>
+        <a:lumOff val="35000"/>
+      </a:schemeClr>
+    </cs:fontRef>
+    <cs:defRPr sz="900"/>
+  </cs:valueAxis>
+  <cs:wall>
+    <cs:lnRef idx="0"/>
+    <cs:fillRef idx="0"/>
+    <cs:effectRef idx="0"/>
+    <cs:fontRef idx="minor">
+      <a:schemeClr val="tx1"/>
+    </cs:fontRef>
+  </cs:wall>
+</cs:chartStyle>
+</file>
+
+<file path=word/charts/style7.xml><?xml version="1.0" encoding="utf-8"?>
+<cs:chartStyle xmlns:cs="http://schemas.microsoft.com/office/drawing/2012/chartStyle" xmlns:a="http://schemas.openxmlformats.org/drawingml/2006/main" id="381">
+  <cs:axisTitle>
+    <cs:lnRef idx="0"/>
+    <cs:fillRef idx="0"/>
+    <cs:effectRef idx="0"/>
+    <cs:fontRef idx="minor">
+      <a:schemeClr val="tx1">
+        <a:lumMod val="65000"/>
+        <a:lumOff val="35000"/>
+      </a:schemeClr>
+    </cs:fontRef>
+    <cs:defRPr sz="900"/>
+  </cs:axisTitle>
+  <cs:categoryAxis>
+    <cs:lnRef idx="0"/>
+    <cs:fillRef idx="0"/>
+    <cs:effectRef idx="0"/>
+    <cs:fontRef idx="minor">
+      <a:schemeClr val="tx1">
+        <a:lumMod val="65000"/>
+        <a:lumOff val="35000"/>
+      </a:schemeClr>
+    </cs:fontRef>
+    <cs:spPr>
+      <a:ln w="9525" cap="flat" cmpd="sng" algn="ctr">
+        <a:solidFill>
+          <a:schemeClr val="tx1">
+            <a:lumMod val="15000"/>
+            <a:lumOff val="85000"/>
+          </a:schemeClr>
+        </a:solidFill>
+        <a:round/>
+      </a:ln>
+    </cs:spPr>
+    <cs:defRPr sz="900"/>
+  </cs:categoryAxis>
+  <cs:chartArea mods="allowNoFillOverride allowNoLineOverride">
+    <cs:lnRef idx="0"/>
+    <cs:fillRef idx="0"/>
+    <cs:effectRef idx="0"/>
+    <cs:fontRef idx="minor">
+      <a:schemeClr val="tx1"/>
+    </cs:fontRef>
+    <cs:spPr>
+      <a:solidFill>
+        <a:schemeClr val="bg1"/>
+      </a:solidFill>
+      <a:ln w="9525" cap="flat" cmpd="sng" algn="ctr">
+        <a:solidFill>
+          <a:schemeClr val="tx1">
+            <a:lumMod val="15000"/>
+            <a:lumOff val="85000"/>
+          </a:schemeClr>
+        </a:solidFill>
+        <a:round/>
+      </a:ln>
+    </cs:spPr>
+    <cs:defRPr sz="1000"/>
+  </cs:chartArea>
+  <cs:dataLabel>
+    <cs:lnRef idx="0"/>
+    <cs:fillRef idx="0"/>
+    <cs:effectRef idx="0"/>
+    <cs:fontRef idx="minor">
+      <a:schemeClr val="lt1"/>
+    </cs:fontRef>
+    <cs:defRPr sz="900"/>
+  </cs:dataLabel>
+  <cs:dataLabelCallout>
+    <cs:lnRef idx="0"/>
+    <cs:fillRef idx="0"/>
+    <cs:effectRef idx="0"/>
+    <cs:fontRef idx="minor">
+      <a:schemeClr val="dk1">
+        <a:lumMod val="65000"/>
+        <a:lumOff val="35000"/>
+      </a:schemeClr>
+    </cs:fontRef>
+    <cs:spPr>
+      <a:solidFill>
+        <a:schemeClr val="lt1"/>
+      </a:solidFill>
+      <a:ln>
+        <a:solidFill>
+          <a:schemeClr val="dk1">
+            <a:lumMod val="25000"/>
+            <a:lumOff val="75000"/>
+          </a:schemeClr>
+        </a:solidFill>
+      </a:ln>
+    </cs:spPr>
+    <cs:defRPr sz="900"/>
+    <cs:bodyPr rot="0" spcFirstLastPara="1" vertOverflow="clip" horzOverflow="clip" vert="horz" wrap="square" lIns="36576" tIns="18288" rIns="36576" bIns="18288" anchor="ctr" anchorCtr="1">
+      <a:spAutoFit/>
+    </cs:bodyPr>
+  </cs:dataLabelCallout>
+  <cs:dataPoint>
+    <cs:lnRef idx="0"/>
+    <cs:fillRef idx="0">
+      <cs:styleClr val="auto"/>
+    </cs:fillRef>
+    <cs:effectRef idx="0"/>
+    <cs:fontRef idx="minor">
+      <a:schemeClr val="tx1"/>
+    </cs:fontRef>
+    <cs:spPr>
+      <a:solidFill>
+        <a:schemeClr val="phClr"/>
+      </a:solidFill>
+      <a:ln w="19050">
+        <a:solidFill>
+          <a:schemeClr val="lt1"/>
+        </a:solidFill>
+      </a:ln>
     </cs:spPr>
   </cs:dataPoint>
   <cs:dataPoint3D>

</xml_diff>